<commit_message>
Update report and project files
</commit_message>
<xml_diff>
--- a/Report.docx
+++ b/Report.docx
@@ -312,19 +312,56 @@
           <w:sz w:val="28"/>
           <w:szCs w:val="28"/>
         </w:rPr>
-        <w:t xml:space="preserve">AVL </w:t>
-      </w:r>
-      <w:proofErr w:type="spellStart"/>
-      <w:r>
+        <w:t>AVL Tree</w:t>
+      </w:r>
+    </w:p>
+    <w:p>
+      <w:pPr>
+        <w:pStyle w:val="oancuaDanhsach"/>
+        <w:ind w:left="1080"/>
+      </w:pPr>
+    </w:p>
+    <w:p>
+      <w:pPr>
+        <w:pStyle w:val="oancuaDanhsach"/>
+        <w:numPr>
+          <w:ilvl w:val="0"/>
+          <w:numId w:val="26"/>
+        </w:numPr>
+      </w:pPr>
+      <w:r>
+        <w:t>Dùng để lưu trữ bệnh nhân bằng mã số bệnh nhân kết hợp với bảng băm để có thể xóa, thêm và tìm kiếm nhanh.</w:t>
+      </w:r>
+    </w:p>
+    <w:p>
+      <w:pPr>
+        <w:pStyle w:val="oancuaDanhsach"/>
+        <w:ind w:left="1440"/>
+      </w:pPr>
+    </w:p>
+    <w:p>
+      <w:pPr>
+        <w:pStyle w:val="oancuaDanhsach"/>
+        <w:numPr>
+          <w:ilvl w:val="0"/>
+          <w:numId w:val="25"/>
+        </w:numPr>
         <w:rPr>
           <w:b/>
           <w:bCs/>
           <w:sz w:val="28"/>
           <w:szCs w:val="28"/>
         </w:rPr>
-        <w:t>Tree</w:t>
-      </w:r>
-      <w:proofErr w:type="spellEnd"/>
+      </w:pPr>
+      <w:r>
+        <w:rPr>
+          <w:b/>
+          <w:bCs/>
+          <w:sz w:val="28"/>
+          <w:szCs w:val="28"/>
+        </w:rPr>
+        <w:t>Hash Table</w:t>
+      </w:r>
     </w:p>
     <w:p>
       <w:pPr>
@@ -341,7 +378,10 @@
         </w:numPr>
       </w:pPr>
       <w:r>
-        <w:t>Dùng để lưu trữ bệnh nhân bằng mã số bệnh nhân kết hợp với bảng băm để có thể xóa, thêm và tìm kiếm nhanh.</w:t>
+        <w:t xml:space="preserve">Dùng để lưu trữ bệnh nhân thông qua mã số bệnh nhân </w:t>
+      </w:r>
+      <w:r>
+        <w:t>kết hợp với AVL Tree để tăng tốc độ chèn, xóa và tìm kiếm bệnh nhân.</w:t>
       </w:r>
     </w:p>
     <w:p>
@@ -364,7 +404,6 @@
           <w:szCs w:val="28"/>
         </w:rPr>
       </w:pPr>
-      <w:proofErr w:type="spellStart"/>
       <w:r>
         <w:rPr>
           <w:b/>
@@ -372,34 +411,79 @@
           <w:sz w:val="28"/>
           <w:szCs w:val="28"/>
         </w:rPr>
-        <w:t>Hash</w:t>
-      </w:r>
-      <w:proofErr w:type="spellEnd"/>
-      <w:r>
+        <w:t>Queue</w:t>
+      </w:r>
+    </w:p>
+    <w:p>
+      <w:pPr>
+        <w:pStyle w:val="oancuaDanhsach"/>
+        <w:ind w:left="1080"/>
         <w:rPr>
           <w:b/>
           <w:bCs/>
           <w:sz w:val="28"/>
           <w:szCs w:val="28"/>
         </w:rPr>
-        <w:t xml:space="preserve"> </w:t>
-      </w:r>
-      <w:proofErr w:type="spellStart"/>
-      <w:r>
+      </w:pPr>
+    </w:p>
+    <w:p>
+      <w:pPr>
+        <w:pStyle w:val="oancuaDanhsach"/>
+        <w:numPr>
+          <w:ilvl w:val="0"/>
+          <w:numId w:val="26"/>
+        </w:numPr>
+      </w:pPr>
+      <w:r>
+        <w:t>Dùng để quản lí hàng người tới khám theo nguyên tắc FIFO.</w:t>
+      </w:r>
+    </w:p>
+    <w:p>
+      <w:pPr>
+        <w:pStyle w:val="oancuaDanhsach"/>
+        <w:ind w:left="1080"/>
         <w:rPr>
           <w:b/>
           <w:bCs/>
           <w:sz w:val="28"/>
           <w:szCs w:val="28"/>
         </w:rPr>
-        <w:t>Table</w:t>
-      </w:r>
-      <w:proofErr w:type="spellEnd"/>
+      </w:pPr>
+    </w:p>
+    <w:p>
+      <w:pPr>
+        <w:pStyle w:val="oancuaDanhsach"/>
+        <w:numPr>
+          <w:ilvl w:val="0"/>
+          <w:numId w:val="25"/>
+        </w:numPr>
+        <w:rPr>
+          <w:b/>
+          <w:bCs/>
+          <w:sz w:val="28"/>
+          <w:szCs w:val="28"/>
+        </w:rPr>
+      </w:pPr>
+      <w:r>
+        <w:rPr>
+          <w:b/>
+          <w:bCs/>
+          <w:sz w:val="28"/>
+          <w:szCs w:val="28"/>
+        </w:rPr>
+        <w:t>Priority Queue</w:t>
+      </w:r>
     </w:p>
     <w:p>
       <w:pPr>
         <w:pStyle w:val="oancuaDanhsach"/>
         <w:ind w:left="1080"/>
+        <w:rPr>
+          <w:b/>
+          <w:bCs/>
+          <w:sz w:val="28"/>
+          <w:szCs w:val="28"/>
+        </w:rPr>
       </w:pPr>
     </w:p>
     <w:p>
@@ -411,24 +495,19 @@
         </w:numPr>
       </w:pPr>
       <w:r>
-        <w:t xml:space="preserve">Dùng để lưu trữ bệnh nhân thông qua mã số bệnh nhân </w:t>
-      </w:r>
-      <w:r>
-        <w:t xml:space="preserve">kết hợp với AVL </w:t>
-      </w:r>
-      <w:proofErr w:type="spellStart"/>
-      <w:r>
-        <w:t>Tree</w:t>
-      </w:r>
-      <w:proofErr w:type="spellEnd"/>
-      <w:r>
-        <w:t xml:space="preserve"> để tăng tốc độ chèn, xóa và tìm kiếm bệnh nhân.</w:t>
-      </w:r>
-    </w:p>
-    <w:p>
-      <w:pPr>
-        <w:pStyle w:val="oancuaDanhsach"/>
-        <w:ind w:left="1440"/>
+        <w:t>Dùng để quản lí các bệnh nhân có mức độ bệnh cao (cấp cứu hoặc nặng) để có thể xử lý các bệnh nhân có mức độ bệnh nặng hơn.</w:t>
+      </w:r>
+    </w:p>
+    <w:p>
+      <w:pPr>
+        <w:pStyle w:val="oancuaDanhsach"/>
+        <w:ind w:left="1080"/>
+        <w:rPr>
+          <w:b/>
+          <w:bCs/>
+          <w:sz w:val="28"/>
+          <w:szCs w:val="28"/>
+        </w:rPr>
       </w:pPr>
     </w:p>
     <w:p>
@@ -445,7 +524,6 @@
           <w:szCs w:val="28"/>
         </w:rPr>
       </w:pPr>
-      <w:proofErr w:type="spellStart"/>
       <w:r>
         <w:rPr>
           <w:b/>
@@ -453,9 +531,8 @@
           <w:sz w:val="28"/>
           <w:szCs w:val="28"/>
         </w:rPr>
-        <w:t>Queue</w:t>
-      </w:r>
-      <w:proofErr w:type="spellEnd"/>
+        <w:t>Algorithm</w:t>
+      </w:r>
     </w:p>
     <w:p>
       <w:pPr>
@@ -478,13 +555,22 @@
         </w:numPr>
       </w:pPr>
       <w:r>
-        <w:t>Dùng để quản lí hàng người tới khám theo nguyên tắc FIFO.</w:t>
-      </w:r>
-    </w:p>
-    <w:p>
-      <w:pPr>
-        <w:pStyle w:val="oancuaDanhsach"/>
-        <w:ind w:left="1080"/>
+        <w:t>Dùng để sắp xếp danh sách bệnh nhân theo mã bệnh nhân, tên hoặc mức độ bệnh để hiển thị.</w:t>
+      </w:r>
+    </w:p>
+    <w:p>
+      <w:pPr>
+        <w:pStyle w:val="oancuaDanhsach"/>
+        <w:ind w:left="1440"/>
+      </w:pPr>
+    </w:p>
+    <w:p>
+      <w:pPr>
+        <w:pStyle w:val="oancuaDanhsach"/>
+        <w:numPr>
+          <w:ilvl w:val="0"/>
+          <w:numId w:val="16"/>
+        </w:numPr>
         <w:rPr>
           <w:b/>
           <w:bCs/>
@@ -492,32 +578,30 @@
           <w:szCs w:val="28"/>
         </w:rPr>
       </w:pPr>
-    </w:p>
-    <w:p>
-      <w:pPr>
-        <w:pStyle w:val="oancuaDanhsach"/>
-        <w:numPr>
-          <w:ilvl w:val="0"/>
-          <w:numId w:val="25"/>
-        </w:numPr>
+      <w:r>
         <w:rPr>
           <w:b/>
           <w:bCs/>
           <w:sz w:val="28"/>
           <w:szCs w:val="28"/>
         </w:rPr>
-      </w:pPr>
-      <w:proofErr w:type="spellStart"/>
-      <w:r>
+        <w:t>Hệ thống các file</w:t>
+      </w:r>
+    </w:p>
+    <w:p>
+      <w:pPr>
+        <w:pStyle w:val="oancuaDanhsach"/>
+        <w:numPr>
+          <w:ilvl w:val="0"/>
+          <w:numId w:val="27"/>
+        </w:numPr>
         <w:rPr>
           <w:b/>
           <w:bCs/>
           <w:sz w:val="28"/>
           <w:szCs w:val="28"/>
         </w:rPr>
-        <w:t>Priority</w:t>
-      </w:r>
-      <w:proofErr w:type="spellEnd"/>
+      </w:pPr>
       <w:r>
         <w:rPr>
           <w:b/>
@@ -525,9 +609,8 @@
           <w:sz w:val="28"/>
           <w:szCs w:val="28"/>
         </w:rPr>
-        <w:t xml:space="preserve"> </w:t>
-      </w:r>
-      <w:proofErr w:type="spellStart"/>
+        <w:t>A</w:t>
+      </w:r>
       <w:r>
         <w:rPr>
           <w:b/>
@@ -535,14 +618,13 @@
           <w:sz w:val="28"/>
           <w:szCs w:val="28"/>
         </w:rPr>
-        <w:t>Queue</w:t>
-      </w:r>
-      <w:proofErr w:type="spellEnd"/>
-    </w:p>
-    <w:p>
-      <w:pPr>
-        <w:pStyle w:val="oancuaDanhsach"/>
-        <w:ind w:left="1080"/>
+        <w:t>pp</w:t>
+      </w:r>
+    </w:p>
+    <w:p>
+      <w:pPr>
+        <w:pStyle w:val="oancuaDanhsach"/>
+        <w:ind w:left="1440"/>
         <w:rPr>
           <w:b/>
           <w:bCs/>
@@ -560,13 +642,97 @@
         </w:numPr>
       </w:pPr>
       <w:r>
-        <w:t>Dùng để quản lí các bệnh nhân có mức độ bệnh cao (cấp cứu hoặc nặng) để có thể xử lý các bệnh nhân có mức độ bệnh nặng hơn.</w:t>
-      </w:r>
-    </w:p>
-    <w:p>
-      <w:pPr>
-        <w:pStyle w:val="oancuaDanhsach"/>
-        <w:ind w:left="1080"/>
+        <w:t>main.cpp: Là nơi bắt đầu ứng dụng, hiển thị menu và các chức năng</w:t>
+      </w:r>
+    </w:p>
+    <w:p>
+      <w:pPr>
+        <w:pStyle w:val="oancuaDanhsach"/>
+        <w:numPr>
+          <w:ilvl w:val="0"/>
+          <w:numId w:val="26"/>
+        </w:numPr>
+      </w:pPr>
+      <w:r>
+        <w:t>menus</w:t>
+      </w:r>
+      <w:r>
+        <w:t>:</w:t>
+      </w:r>
+    </w:p>
+    <w:p>
+      <w:pPr>
+        <w:pStyle w:val="oancuaDanhsach"/>
+        <w:numPr>
+          <w:ilvl w:val="0"/>
+          <w:numId w:val="28"/>
+        </w:numPr>
+      </w:pPr>
+      <w:r>
+        <w:t>HospitalManagement.</w:t>
+      </w:r>
+      <w:r>
+        <w:t>hpp: Hiển thị menu để quản lí bệnh nhân trong bệnh viện và thực thi các các hoạt động.</w:t>
+      </w:r>
+    </w:p>
+    <w:p>
+      <w:pPr>
+        <w:pStyle w:val="oancuaDanhsach"/>
+        <w:numPr>
+          <w:ilvl w:val="0"/>
+          <w:numId w:val="28"/>
+        </w:numPr>
+      </w:pPr>
+      <w:r>
+        <w:t>VisitedPatientMenu.</w:t>
+      </w:r>
+      <w:r>
+        <w:t xml:space="preserve">hpp: Hiển thị menu để quản lí hàng khách chỉ tới khám </w:t>
+      </w:r>
+      <w:r>
+        <w:t>chưa phải là bệnh nhân.</w:t>
+      </w:r>
+    </w:p>
+    <w:p>
+      <w:pPr>
+        <w:pStyle w:val="oancuaDanhsach"/>
+        <w:numPr>
+          <w:ilvl w:val="0"/>
+          <w:numId w:val="28"/>
+        </w:numPr>
+      </w:pPr>
+      <w:r>
+        <w:t>EmergencyMenu.</w:t>
+      </w:r>
+      <w:r>
+        <w:t>hpp: Hiển thị menu quản lí các bệnh nhân ở mức độ được ưu tiên (năng và cấp cứu).</w:t>
+      </w:r>
+    </w:p>
+    <w:p>
+      <w:pPr>
+        <w:pStyle w:val="oancuaDanhsach"/>
+        <w:numPr>
+          <w:ilvl w:val="0"/>
+          <w:numId w:val="28"/>
+        </w:numPr>
+      </w:pPr>
+      <w:r>
+        <w:t>menu.hpp: dọn sạch màn hình sau các thao tác</w:t>
+      </w:r>
+    </w:p>
+    <w:p>
+      <w:pPr>
+        <w:pStyle w:val="oancuaDanhsach"/>
+        <w:ind w:left="2160"/>
+      </w:pPr>
+    </w:p>
+    <w:p>
+      <w:pPr>
+        <w:pStyle w:val="oancuaDanhsach"/>
+        <w:numPr>
+          <w:ilvl w:val="0"/>
+          <w:numId w:val="27"/>
+        </w:numPr>
         <w:rPr>
           <w:b/>
           <w:bCs/>
@@ -574,43 +740,128 @@
           <w:szCs w:val="28"/>
         </w:rPr>
       </w:pPr>
-    </w:p>
-    <w:p>
-      <w:pPr>
-        <w:pStyle w:val="oancuaDanhsach"/>
-        <w:numPr>
-          <w:ilvl w:val="0"/>
-          <w:numId w:val="25"/>
-        </w:numPr>
+      <w:r>
         <w:rPr>
           <w:b/>
           <w:bCs/>
           <w:sz w:val="28"/>
           <w:szCs w:val="28"/>
         </w:rPr>
-      </w:pPr>
-      <w:proofErr w:type="spellStart"/>
-      <w:r>
+        <w:t>lib</w:t>
+      </w:r>
+    </w:p>
+    <w:p>
+      <w:pPr>
+        <w:pStyle w:val="oancuaDanhsach"/>
+        <w:ind w:left="1440"/>
+      </w:pPr>
+    </w:p>
+    <w:p>
+      <w:pPr>
+        <w:pStyle w:val="oancuaDanhsach"/>
+        <w:ind w:left="1440"/>
+      </w:pPr>
+      <w:r>
+        <w:t>Nơi cài đặt các thư viện</w:t>
+      </w:r>
+      <w:r>
+        <w:t xml:space="preserve"> Algorithm, Hash Table, Queue, Priority Queue, AVL Tree, BST, Linked List, Stack</w:t>
+      </w:r>
+      <w:r>
+        <w:t xml:space="preserve"> để sử dụng.</w:t>
+      </w:r>
+    </w:p>
+    <w:p>
+      <w:pPr>
+        <w:pStyle w:val="oancuaDanhsach"/>
+        <w:ind w:left="1440"/>
+      </w:pPr>
+    </w:p>
+    <w:p>
+      <w:pPr>
+        <w:pStyle w:val="oancuaDanhsach"/>
+        <w:numPr>
+          <w:ilvl w:val="0"/>
+          <w:numId w:val="27"/>
+        </w:numPr>
         <w:rPr>
           <w:b/>
           <w:bCs/>
           <w:sz w:val="28"/>
           <w:szCs w:val="28"/>
         </w:rPr>
-        <w:t>Algorithm</w:t>
-      </w:r>
-      <w:proofErr w:type="spellEnd"/>
-    </w:p>
-    <w:p>
-      <w:pPr>
-        <w:pStyle w:val="oancuaDanhsach"/>
-        <w:ind w:left="1080"/>
+      </w:pPr>
+      <w:r>
         <w:rPr>
           <w:b/>
           <w:bCs/>
           <w:sz w:val="28"/>
           <w:szCs w:val="28"/>
         </w:rPr>
+        <w:t>models</w:t>
+      </w:r>
+    </w:p>
+    <w:p>
+      <w:pPr>
+        <w:pStyle w:val="oancuaDanhsach"/>
+        <w:ind w:left="1440"/>
+      </w:pPr>
+    </w:p>
+    <w:p>
+      <w:pPr>
+        <w:pStyle w:val="oancuaDanhsach"/>
+        <w:ind w:left="1440"/>
+      </w:pPr>
+      <w:r>
+        <w:t>Là nơi chứa các cấu trúc của một bệnh nhân (Patient), một người khách tới để khám (VisitPatient).</w:t>
+      </w:r>
+    </w:p>
+    <w:p>
+      <w:pPr>
+        <w:pStyle w:val="oancuaDanhsach"/>
+        <w:ind w:left="1440"/>
+        <w:rPr>
+          <w:b/>
+          <w:bCs/>
+          <w:sz w:val="28"/>
+          <w:szCs w:val="28"/>
+        </w:rPr>
+      </w:pPr>
+    </w:p>
+    <w:p>
+      <w:pPr>
+        <w:pStyle w:val="oancuaDanhsach"/>
+        <w:numPr>
+          <w:ilvl w:val="0"/>
+          <w:numId w:val="27"/>
+        </w:numPr>
+        <w:rPr>
+          <w:b/>
+          <w:bCs/>
+          <w:sz w:val="28"/>
+          <w:szCs w:val="28"/>
+        </w:rPr>
+      </w:pPr>
+      <w:r>
+        <w:rPr>
+          <w:b/>
+          <w:bCs/>
+          <w:sz w:val="28"/>
+          <w:szCs w:val="28"/>
+        </w:rPr>
+        <w:t xml:space="preserve">system </w:t>
+      </w:r>
+    </w:p>
+    <w:p>
+      <w:pPr>
+        <w:pStyle w:val="oancuaDanhsach"/>
+        <w:ind w:left="1080"/>
+        <w:rPr>
+          <w:b/>
+          <w:bCs/>
+          <w:sz w:val="28"/>
+          <w:szCs w:val="28"/>
+        </w:rPr>
       </w:pPr>
     </w:p>
     <w:p>
@@ -622,13 +873,89 @@
         </w:numPr>
       </w:pPr>
       <w:r>
-        <w:t>Dùng để sắp xếp danh sách bệnh nhân theo mã bệnh nhân, tên hoặc mức độ bệnh để hiển thị.</w:t>
-      </w:r>
-    </w:p>
-    <w:p>
-      <w:pPr>
-        <w:pStyle w:val="oancuaDanhsach"/>
-        <w:ind w:left="1440"/>
+        <w:t>FileService.hpp: dùng để đọc dữ liệu</w:t>
+      </w:r>
+      <w:r>
+        <w:t xml:space="preserve"> và lưu dữ liệu của</w:t>
+      </w:r>
+      <w:r>
+        <w:t xml:space="preserve"> các bệnh nhân </w:t>
+      </w:r>
+      <w:r>
+        <w:t>vào</w:t>
+      </w:r>
+      <w:r>
+        <w:t xml:space="preserve"> trong file patient.txt.</w:t>
+      </w:r>
+    </w:p>
+    <w:p>
+      <w:pPr>
+        <w:pStyle w:val="oancuaDanhsach"/>
+        <w:numPr>
+          <w:ilvl w:val="0"/>
+          <w:numId w:val="26"/>
+        </w:numPr>
+      </w:pPr>
+      <w:r>
+        <w:t xml:space="preserve">PatientHashTable.hpp: dùng để quản lí các bệnh nhân trong hệ thống bệnh viện dưới dạng một bảng băm với kiểu dữ liệu </w:t>
+      </w:r>
+      <w:r>
+        <w:t>AVL như thêm, xóa, tìm kiếm, hiển thị bệnh nhân.</w:t>
+      </w:r>
+    </w:p>
+    <w:p>
+      <w:pPr>
+        <w:pStyle w:val="oancuaDanhsach"/>
+        <w:numPr>
+          <w:ilvl w:val="0"/>
+          <w:numId w:val="26"/>
+        </w:numPr>
+      </w:pPr>
+      <w:r>
+        <w:t>PatientService.hpp: là phần chịu trách nhiệm hiển thị khi thao tác và sử dụng các hàm trong PatientHashTable.hpp.</w:t>
+      </w:r>
+    </w:p>
+    <w:p>
+      <w:pPr>
+        <w:pStyle w:val="oancuaDanhsach"/>
+        <w:numPr>
+          <w:ilvl w:val="0"/>
+          <w:numId w:val="26"/>
+        </w:numPr>
+      </w:pPr>
+      <w:r>
+        <w:lastRenderedPageBreak/>
+        <w:t xml:space="preserve">VisitService.hpp: </w:t>
+      </w:r>
+      <w:r>
+        <w:t>quản lí hàng đợi bằng cấu trúc dữ liệu queue</w:t>
+      </w:r>
+      <w:r>
+        <w:t>.</w:t>
+      </w:r>
+    </w:p>
+    <w:p>
+      <w:pPr>
+        <w:pStyle w:val="oancuaDanhsach"/>
+        <w:numPr>
+          <w:ilvl w:val="0"/>
+          <w:numId w:val="26"/>
+        </w:numPr>
+      </w:pPr>
+      <w:r>
+        <w:t>EmergencyService.hpp: chịu trách nhiệm quản lí các bệnh nhân có mức độ bệnh cao (nặng và cấp cứu) với một biến priority queue được sử dụng trong hàm và sẽ được lưu trữ trong file.</w:t>
+      </w:r>
+    </w:p>
+    <w:p>
+      <w:pPr>
+        <w:pStyle w:val="oancuaDanhsach"/>
+        <w:ind w:left="1080"/>
+        <w:rPr>
+          <w:b/>
+          <w:bCs/>
+          <w:sz w:val="28"/>
+          <w:szCs w:val="28"/>
+        </w:rPr>
       </w:pPr>
     </w:p>
     <w:p>
@@ -652,35 +979,490 @@
           <w:sz w:val="28"/>
           <w:szCs w:val="28"/>
         </w:rPr>
-        <w:t xml:space="preserve">Hệ thống các </w:t>
-      </w:r>
-      <w:proofErr w:type="spellStart"/>
-      <w:r>
+        <w:t>Luồng hoạt động của chương trình</w:t>
+      </w:r>
+    </w:p>
+    <w:p>
+      <w:pPr>
+        <w:pStyle w:val="oancuaDanhsach"/>
+        <w:ind w:left="1080"/>
         <w:rPr>
           <w:b/>
           <w:bCs/>
           <w:sz w:val="28"/>
           <w:szCs w:val="28"/>
         </w:rPr>
-        <w:t>file</w:t>
-      </w:r>
-      <w:proofErr w:type="spellEnd"/>
+      </w:pPr>
     </w:p>
     <w:p>
       <w:pPr>
         <w:pStyle w:val="oancuaDanhsach"/>
         <w:numPr>
           <w:ilvl w:val="0"/>
-          <w:numId w:val="27"/>
+          <w:numId w:val="29"/>
         </w:numPr>
+        <w:rPr>
+          <w:sz w:val="26"/>
+          <w:szCs w:val="26"/>
+        </w:rPr>
+      </w:pPr>
+      <w:r>
+        <w:rPr>
+          <w:sz w:val="26"/>
+          <w:szCs w:val="26"/>
+        </w:rPr>
+        <w:t>Người đùng khởi động chương trình</w:t>
+      </w:r>
+    </w:p>
+    <w:p>
+      <w:pPr>
+        <w:pStyle w:val="oancuaDanhsach"/>
+        <w:ind w:left="1440"/>
+        <w:rPr>
+          <w:sz w:val="26"/>
+          <w:szCs w:val="26"/>
+        </w:rPr>
+      </w:pPr>
+    </w:p>
+    <w:p>
+      <w:pPr>
+        <w:pStyle w:val="oancuaDanhsach"/>
+        <w:numPr>
+          <w:ilvl w:val="0"/>
+          <w:numId w:val="29"/>
+        </w:numPr>
+        <w:rPr>
+          <w:sz w:val="26"/>
+          <w:szCs w:val="26"/>
+        </w:rPr>
+      </w:pPr>
+      <w:r>
+        <w:rPr>
+          <w:sz w:val="26"/>
+          <w:szCs w:val="26"/>
+        </w:rPr>
+        <w:t>Chương trình bắt đầu</w:t>
+      </w:r>
+      <w:r>
+        <w:rPr>
+          <w:sz w:val="26"/>
+          <w:szCs w:val="26"/>
+        </w:rPr>
+        <w:t xml:space="preserve"> chạy và đọc dữ liệu từ patient.txt nhờ FileService</w:t>
+      </w:r>
+    </w:p>
+    <w:p>
+      <w:pPr>
+        <w:pStyle w:val="oancuaDanhsach"/>
+        <w:rPr>
+          <w:sz w:val="26"/>
+          <w:szCs w:val="26"/>
+        </w:rPr>
+      </w:pPr>
+    </w:p>
+    <w:p>
+      <w:pPr>
+        <w:pStyle w:val="oancuaDanhsach"/>
+        <w:numPr>
+          <w:ilvl w:val="0"/>
+          <w:numId w:val="29"/>
+        </w:numPr>
+        <w:rPr>
+          <w:sz w:val="26"/>
+          <w:szCs w:val="26"/>
+        </w:rPr>
+      </w:pPr>
+      <w:r>
+        <w:rPr>
+          <w:sz w:val="26"/>
+          <w:szCs w:val="26"/>
+        </w:rPr>
+        <w:t>Menu chính của ứng dụng được hiển thị và cho phép lựa chọn thao tác</w:t>
+      </w:r>
+    </w:p>
+    <w:p>
+      <w:pPr>
+        <w:pStyle w:val="oancuaDanhsach"/>
+        <w:rPr>
+          <w:sz w:val="26"/>
+          <w:szCs w:val="26"/>
+        </w:rPr>
+      </w:pPr>
+    </w:p>
+    <w:p>
+      <w:pPr>
+        <w:pStyle w:val="oancuaDanhsach"/>
+        <w:numPr>
+          <w:ilvl w:val="0"/>
+          <w:numId w:val="29"/>
+        </w:numPr>
+        <w:rPr>
+          <w:sz w:val="26"/>
+          <w:szCs w:val="26"/>
+        </w:rPr>
+      </w:pPr>
+      <w:r>
+        <w:rPr>
+          <w:sz w:val="26"/>
+          <w:szCs w:val="26"/>
+        </w:rPr>
+        <w:t>Nếu chọn quản lí bệnh nhân sẽ có thực hiện:</w:t>
+      </w:r>
+    </w:p>
+    <w:p>
+      <w:pPr>
+        <w:pStyle w:val="oancuaDanhsach"/>
+        <w:rPr>
+          <w:sz w:val="26"/>
+          <w:szCs w:val="26"/>
+        </w:rPr>
+      </w:pPr>
+    </w:p>
+    <w:p>
+      <w:pPr>
+        <w:pStyle w:val="oancuaDanhsach"/>
+        <w:numPr>
+          <w:ilvl w:val="0"/>
+          <w:numId w:val="33"/>
+        </w:numPr>
+      </w:pPr>
+      <w:r>
+        <w:t>Thêm bệnh nhân mới.</w:t>
+      </w:r>
+    </w:p>
+    <w:p>
+      <w:pPr>
+        <w:pStyle w:val="oancuaDanhsach"/>
+        <w:numPr>
+          <w:ilvl w:val="0"/>
+          <w:numId w:val="33"/>
+        </w:numPr>
+      </w:pPr>
+      <w:r>
+        <w:t>Tìm bệnh nhân.</w:t>
+      </w:r>
+    </w:p>
+    <w:p>
+      <w:pPr>
+        <w:pStyle w:val="oancuaDanhsach"/>
+        <w:numPr>
+          <w:ilvl w:val="0"/>
+          <w:numId w:val="33"/>
+        </w:numPr>
+      </w:pPr>
+      <w:r>
+        <w:t>Xóa bệnh nhân khỏi danh sách.</w:t>
+      </w:r>
+    </w:p>
+    <w:p>
+      <w:pPr>
+        <w:pStyle w:val="oancuaDanhsach"/>
+        <w:numPr>
+          <w:ilvl w:val="0"/>
+          <w:numId w:val="33"/>
+        </w:numPr>
+      </w:pPr>
+      <w:r>
+        <w:t>Quay lại menu chính.</w:t>
+      </w:r>
+    </w:p>
+    <w:p>
+      <w:pPr>
+        <w:pStyle w:val="oancuaDanhsach"/>
+        <w:ind w:left="2232"/>
+      </w:pPr>
+    </w:p>
+    <w:p>
+      <w:pPr>
+        <w:pStyle w:val="oancuaDanhsach"/>
+        <w:numPr>
+          <w:ilvl w:val="0"/>
+          <w:numId w:val="29"/>
+        </w:numPr>
+        <w:rPr>
+          <w:sz w:val="26"/>
+          <w:szCs w:val="26"/>
+        </w:rPr>
+      </w:pPr>
+      <w:r>
+        <w:rPr>
+          <w:sz w:val="26"/>
+          <w:szCs w:val="26"/>
+        </w:rPr>
+        <w:t>Nếu chọn đăng kí khám sẽ có thể thực hiện:</w:t>
+      </w:r>
+    </w:p>
+    <w:p>
+      <w:pPr>
+        <w:pStyle w:val="oancuaDanhsach"/>
+        <w:ind w:left="1440"/>
+        <w:rPr>
+          <w:sz w:val="26"/>
+          <w:szCs w:val="26"/>
+        </w:rPr>
+      </w:pPr>
+    </w:p>
+    <w:p>
+      <w:pPr>
+        <w:pStyle w:val="oancuaDanhsach"/>
+        <w:numPr>
+          <w:ilvl w:val="0"/>
+          <w:numId w:val="33"/>
+        </w:numPr>
+        <w:rPr>
+          <w:sz w:val="26"/>
+          <w:szCs w:val="26"/>
+        </w:rPr>
+      </w:pPr>
+      <w:r>
+        <w:rPr>
+          <w:sz w:val="26"/>
+          <w:szCs w:val="26"/>
+        </w:rPr>
+        <w:t>Đăng kí khám.</w:t>
+      </w:r>
+    </w:p>
+    <w:p>
+      <w:pPr>
+        <w:pStyle w:val="oancuaDanhsach"/>
+        <w:numPr>
+          <w:ilvl w:val="0"/>
+          <w:numId w:val="33"/>
+        </w:numPr>
+        <w:rPr>
+          <w:sz w:val="26"/>
+          <w:szCs w:val="26"/>
+        </w:rPr>
+      </w:pPr>
+      <w:r>
+        <w:rPr>
+          <w:sz w:val="26"/>
+          <w:szCs w:val="26"/>
+        </w:rPr>
+        <w:t>Gọi bệnh nhân tiếp theo và xóa khỏi danh sách.</w:t>
+      </w:r>
+    </w:p>
+    <w:p>
+      <w:pPr>
+        <w:pStyle w:val="oancuaDanhsach"/>
+        <w:numPr>
+          <w:ilvl w:val="0"/>
+          <w:numId w:val="33"/>
+        </w:numPr>
+        <w:rPr>
+          <w:sz w:val="26"/>
+          <w:szCs w:val="26"/>
+        </w:rPr>
+      </w:pPr>
+      <w:r>
+        <w:rPr>
+          <w:sz w:val="26"/>
+          <w:szCs w:val="26"/>
+        </w:rPr>
+        <w:t>Xem thông tin bệnh nhân đầu hàng chờ và số lượng khách đang chờ.</w:t>
+      </w:r>
+    </w:p>
+    <w:p>
+      <w:pPr>
+        <w:pStyle w:val="oancuaDanhsach"/>
+        <w:numPr>
+          <w:ilvl w:val="0"/>
+          <w:numId w:val="33"/>
+        </w:numPr>
+        <w:rPr>
+          <w:sz w:val="26"/>
+          <w:szCs w:val="26"/>
+        </w:rPr>
+      </w:pPr>
+      <w:r>
+        <w:rPr>
+          <w:sz w:val="26"/>
+          <w:szCs w:val="26"/>
+        </w:rPr>
+        <w:t>Quay lại menu chính.</w:t>
+      </w:r>
+    </w:p>
+    <w:p>
+      <w:pPr>
+        <w:pStyle w:val="oancuaDanhsach"/>
+        <w:ind w:left="2232"/>
+        <w:rPr>
+          <w:sz w:val="26"/>
+          <w:szCs w:val="26"/>
+        </w:rPr>
+      </w:pPr>
+    </w:p>
+    <w:p>
+      <w:pPr>
+        <w:pStyle w:val="oancuaDanhsach"/>
+        <w:numPr>
+          <w:ilvl w:val="0"/>
+          <w:numId w:val="29"/>
+        </w:numPr>
+        <w:rPr>
+          <w:sz w:val="26"/>
+          <w:szCs w:val="26"/>
+        </w:rPr>
+      </w:pPr>
+      <w:r>
+        <w:rPr>
+          <w:sz w:val="26"/>
+          <w:szCs w:val="26"/>
+        </w:rPr>
+        <w:t>Nếu chọn quản lí cấp cứu sẽ có thể thực hiện:</w:t>
+      </w:r>
+    </w:p>
+    <w:p>
+      <w:pPr>
+        <w:pStyle w:val="oancuaDanhsach"/>
+        <w:ind w:left="2160"/>
+        <w:rPr>
+          <w:sz w:val="26"/>
+          <w:szCs w:val="26"/>
+        </w:rPr>
+      </w:pPr>
+    </w:p>
+    <w:p>
+      <w:pPr>
+        <w:pStyle w:val="oancuaDanhsach"/>
+        <w:numPr>
+          <w:ilvl w:val="0"/>
+          <w:numId w:val="33"/>
+        </w:numPr>
+        <w:rPr>
+          <w:sz w:val="26"/>
+          <w:szCs w:val="26"/>
+        </w:rPr>
+      </w:pPr>
+      <w:r>
+        <w:rPr>
+          <w:sz w:val="26"/>
+          <w:szCs w:val="26"/>
+        </w:rPr>
+        <w:t>Xử lí các bệnh nhân đang có mức độ bệnh cao nhất trước.</w:t>
+      </w:r>
+    </w:p>
+    <w:p>
+      <w:pPr>
+        <w:pStyle w:val="oancuaDanhsach"/>
+        <w:numPr>
+          <w:ilvl w:val="0"/>
+          <w:numId w:val="33"/>
+        </w:numPr>
+        <w:rPr>
+          <w:sz w:val="26"/>
+          <w:szCs w:val="26"/>
+        </w:rPr>
+      </w:pPr>
+      <w:r>
+        <w:rPr>
+          <w:sz w:val="26"/>
+          <w:szCs w:val="26"/>
+        </w:rPr>
+        <w:t>Xem thông tin bệnh nhân ưu tiên cao nhất và số lượng bệnh nhân đang có trong danh sách ưu tiên.</w:t>
+      </w:r>
+    </w:p>
+    <w:p>
+      <w:pPr>
+        <w:pStyle w:val="oancuaDanhsach"/>
+        <w:numPr>
+          <w:ilvl w:val="0"/>
+          <w:numId w:val="33"/>
+        </w:numPr>
+        <w:rPr>
+          <w:sz w:val="26"/>
+          <w:szCs w:val="26"/>
+        </w:rPr>
+      </w:pPr>
+      <w:r>
+        <w:rPr>
+          <w:sz w:val="26"/>
+          <w:szCs w:val="26"/>
+        </w:rPr>
+        <w:t>Quay lại menu chính</w:t>
+      </w:r>
+    </w:p>
+    <w:p>
+      <w:pPr>
+        <w:pStyle w:val="oancuaDanhsach"/>
+        <w:ind w:left="2232"/>
+        <w:rPr>
+          <w:sz w:val="26"/>
+          <w:szCs w:val="26"/>
+        </w:rPr>
+      </w:pPr>
+    </w:p>
+    <w:p>
+      <w:pPr>
+        <w:pStyle w:val="oancuaDanhsach"/>
+        <w:numPr>
+          <w:ilvl w:val="0"/>
+          <w:numId w:val="29"/>
+        </w:numPr>
+        <w:rPr>
+          <w:sz w:val="26"/>
+          <w:szCs w:val="26"/>
+        </w:rPr>
+      </w:pPr>
+      <w:r>
+        <w:rPr>
+          <w:sz w:val="26"/>
+          <w:szCs w:val="26"/>
+        </w:rPr>
+        <w:t>Khi thoát chương trình:</w:t>
+      </w:r>
+    </w:p>
+    <w:p>
+      <w:pPr>
+        <w:pStyle w:val="oancuaDanhsach"/>
+        <w:ind w:left="1440"/>
+        <w:rPr>
+          <w:sz w:val="26"/>
+          <w:szCs w:val="26"/>
+        </w:rPr>
+      </w:pPr>
+    </w:p>
+    <w:p>
+      <w:pPr>
+        <w:pStyle w:val="oancuaDanhsach"/>
+        <w:ind w:left="1440"/>
+        <w:rPr>
+          <w:sz w:val="26"/>
+          <w:szCs w:val="26"/>
+        </w:rPr>
+      </w:pPr>
+      <w:r>
+        <w:rPr>
+          <w:sz w:val="26"/>
+          <w:szCs w:val="26"/>
+        </w:rPr>
+        <w:lastRenderedPageBreak/>
+        <w:t>FileService sẽ lưu trữ dữ liệu của các bệnh nhân (không bao gồm những người tới khám) vào patient.txt để có thể tiếp tục quản lí khi mở lại chương trình.</w:t>
+      </w:r>
+    </w:p>
+    <w:p>
+      <w:pPr>
+        <w:pStyle w:val="oancuaDanhsach"/>
+        <w:ind w:left="1440"/>
+        <w:rPr>
+          <w:sz w:val="26"/>
+          <w:szCs w:val="26"/>
+        </w:rPr>
+      </w:pPr>
+    </w:p>
+    <w:p>
+      <w:pPr>
+        <w:ind w:firstLine="720"/>
+      </w:pPr>
+      <w:r>
         <w:rPr>
           <w:b/>
           <w:bCs/>
           <w:sz w:val="28"/>
           <w:szCs w:val="28"/>
         </w:rPr>
-      </w:pPr>
-      <w:proofErr w:type="spellStart"/>
+        <w:t xml:space="preserve">  </w:t>
+      </w:r>
       <w:r>
         <w:rPr>
           <w:b/>
@@ -688,23 +1470,96 @@
           <w:sz w:val="28"/>
           <w:szCs w:val="28"/>
         </w:rPr>
-        <w:t>A</w:t>
-      </w:r>
-      <w:r>
+        <w:t>## Lưu ý khi sử dụng hệ thống</w:t>
+      </w:r>
+      <w:r>
+        <w:t>:</w:t>
+      </w:r>
+    </w:p>
+    <w:p>
+      <w:pPr>
+        <w:ind w:firstLine="720"/>
+      </w:pPr>
+    </w:p>
+    <w:p>
+      <w:pPr>
+        <w:pStyle w:val="oancuaDanhsach"/>
+        <w:numPr>
+          <w:ilvl w:val="0"/>
+          <w:numId w:val="37"/>
+        </w:numPr>
+      </w:pPr>
+      <w:r>
+        <w:t>Chương trình sẽ tự động tạo mã số bệnh nhân và lưu trữ mã số tiếp theo ở đầu file patient.txt mỗi khi thoát chương trình và sẽ tiếp tục lấy ra sử dụng tiếp khi mở chương trình. Điều này sẽ làm cho mã số của các bệnh nhân được đảm bảo sẽ không trùng nhau.</w:t>
+      </w:r>
+    </w:p>
+    <w:p>
+      <w:pPr>
+        <w:pStyle w:val="oancuaDanhsach"/>
+        <w:numPr>
+          <w:ilvl w:val="0"/>
+          <w:numId w:val="37"/>
+        </w:numPr>
+      </w:pPr>
+      <w:r>
+        <w:t>Chức năng "Gọi bệnh nhân khám tiếp theo" của nhóm chức năng thứ 2 hoạt động theo nguyên tắc FIFO của Queue.</w:t>
+      </w:r>
+    </w:p>
+    <w:p>
+      <w:pPr>
+        <w:pStyle w:val="oancuaDanhsach"/>
+        <w:numPr>
+          <w:ilvl w:val="0"/>
+          <w:numId w:val="37"/>
+        </w:numPr>
+      </w:pPr>
+      <w:r>
+        <w:t>Khi bệnh nhân được gọi khám, bệnh nhân đó sẽ tự động bị xóa khỏi hàng đợi khám. - Điều này cũng khá tương tự với chức năng "Xử lí bệnh nhân có mức độ ưu tiên cao nhất" trong nhóm chức năng thứ 3.</w:t>
+      </w:r>
+    </w:p>
+    <w:p>
+      <w:pPr>
+        <w:pStyle w:val="oancuaDanhsach"/>
+        <w:numPr>
+          <w:ilvl w:val="0"/>
+          <w:numId w:val="37"/>
+        </w:numPr>
+      </w:pPr>
+      <w:r>
+        <w:t>Do đó số lượng bệnh nhân đang chờ khám sẽ giảm đi 1 và bệnh nhân đầu hàng đợi sẽ thay đổi.</w:t>
+      </w:r>
+    </w:p>
+    <w:p>
+      <w:pPr>
+        <w:pStyle w:val="oancuaDanhsach"/>
+        <w:numPr>
+          <w:ilvl w:val="0"/>
+          <w:numId w:val="37"/>
+        </w:numPr>
+      </w:pPr>
+      <w:r>
+        <w:t>Đây là hành vi được thiết kế nhằm mô phỏng đúng quy trình hoạt động thực tế của bệnh viện.</w:t>
+      </w:r>
+    </w:p>
+    <w:p>
+      <w:pPr>
+        <w:pStyle w:val="oancuaDanhsach"/>
+        <w:ind w:left="1080"/>
         <w:rPr>
           <w:b/>
           <w:bCs/>
           <w:sz w:val="28"/>
           <w:szCs w:val="28"/>
         </w:rPr>
-        <w:t>pp</w:t>
-      </w:r>
-      <w:proofErr w:type="spellEnd"/>
-    </w:p>
-    <w:p>
-      <w:pPr>
-        <w:pStyle w:val="oancuaDanhsach"/>
-        <w:ind w:left="1440"/>
+      </w:pPr>
+    </w:p>
+    <w:p>
+      <w:pPr>
+        <w:pStyle w:val="oancuaDanhsach"/>
+        <w:numPr>
+          <w:ilvl w:val="0"/>
+          <w:numId w:val="16"/>
+        </w:numPr>
         <w:rPr>
           <w:b/>
           <w:bCs/>
@@ -712,157 +1567,15 @@
           <w:szCs w:val="28"/>
         </w:rPr>
       </w:pPr>
-    </w:p>
-    <w:p>
-      <w:pPr>
-        <w:pStyle w:val="oancuaDanhsach"/>
-        <w:numPr>
-          <w:ilvl w:val="0"/>
-          <w:numId w:val="26"/>
-        </w:numPr>
-      </w:pPr>
-      <w:r>
-        <w:t xml:space="preserve">main.cpp: Là nơi bắt đầu ứng dụng, hiển thị </w:t>
-      </w:r>
-      <w:proofErr w:type="spellStart"/>
-      <w:r>
-        <w:t>menu</w:t>
-      </w:r>
-      <w:proofErr w:type="spellEnd"/>
-      <w:r>
-        <w:t xml:space="preserve"> và các chức năng</w:t>
-      </w:r>
-    </w:p>
-    <w:p>
-      <w:pPr>
-        <w:pStyle w:val="oancuaDanhsach"/>
-        <w:numPr>
-          <w:ilvl w:val="0"/>
-          <w:numId w:val="26"/>
-        </w:numPr>
-      </w:pPr>
-      <w:proofErr w:type="spellStart"/>
-      <w:r>
-        <w:t>menus</w:t>
-      </w:r>
-      <w:proofErr w:type="spellEnd"/>
-      <w:r>
-        <w:t>:</w:t>
-      </w:r>
-    </w:p>
-    <w:p>
-      <w:pPr>
-        <w:pStyle w:val="oancuaDanhsach"/>
-        <w:numPr>
-          <w:ilvl w:val="0"/>
-          <w:numId w:val="28"/>
-        </w:numPr>
-      </w:pPr>
-      <w:r>
-        <w:t>HospitalManagement.</w:t>
-      </w:r>
-      <w:r>
-        <w:t xml:space="preserve">hpp: Hiển thị </w:t>
-      </w:r>
-      <w:proofErr w:type="spellStart"/>
-      <w:r>
-        <w:t>menu</w:t>
-      </w:r>
-      <w:proofErr w:type="spellEnd"/>
-      <w:r>
-        <w:t xml:space="preserve"> để quản lí bệnh nhân trong bệnh viện và thực thi các </w:t>
-      </w:r>
-      <w:proofErr w:type="spellStart"/>
-      <w:r>
-        <w:t>các</w:t>
-      </w:r>
-      <w:proofErr w:type="spellEnd"/>
-      <w:r>
-        <w:t xml:space="preserve"> hoạt động.</w:t>
-      </w:r>
-    </w:p>
-    <w:p>
-      <w:pPr>
-        <w:pStyle w:val="oancuaDanhsach"/>
-        <w:numPr>
-          <w:ilvl w:val="0"/>
-          <w:numId w:val="28"/>
-        </w:numPr>
-      </w:pPr>
-      <w:r>
-        <w:t>VisitedPatientMenu.</w:t>
-      </w:r>
-      <w:r>
-        <w:t xml:space="preserve">hpp: Hiển thị </w:t>
-      </w:r>
-      <w:proofErr w:type="spellStart"/>
-      <w:r>
-        <w:t>menu</w:t>
-      </w:r>
-      <w:proofErr w:type="spellEnd"/>
-      <w:r>
-        <w:t xml:space="preserve"> để quản lí hàng khách chỉ tới khám </w:t>
-      </w:r>
-      <w:r>
-        <w:t>chưa phải là bệnh nhân.</w:t>
-      </w:r>
-    </w:p>
-    <w:p>
-      <w:pPr>
-        <w:pStyle w:val="oancuaDanhsach"/>
-        <w:numPr>
-          <w:ilvl w:val="0"/>
-          <w:numId w:val="28"/>
-        </w:numPr>
-      </w:pPr>
-      <w:r>
-        <w:t>EmergencyMenu.</w:t>
-      </w:r>
-      <w:r>
-        <w:t xml:space="preserve">hpp: Hiển thị </w:t>
-      </w:r>
-      <w:proofErr w:type="spellStart"/>
-      <w:r>
-        <w:t>menu</w:t>
-      </w:r>
-      <w:proofErr w:type="spellEnd"/>
-      <w:r>
-        <w:t xml:space="preserve"> quản lí các bệnh nhân ở mức độ được ưu tiên (năng và cấp cứu).</w:t>
-      </w:r>
-    </w:p>
-    <w:p>
-      <w:pPr>
-        <w:pStyle w:val="oancuaDanhsach"/>
-        <w:numPr>
-          <w:ilvl w:val="0"/>
-          <w:numId w:val="28"/>
-        </w:numPr>
-      </w:pPr>
-      <w:r>
-        <w:t>menu.hpp: dọn sạch màn hình sau các thao tác</w:t>
-      </w:r>
-    </w:p>
-    <w:p>
-      <w:pPr>
-        <w:pStyle w:val="oancuaDanhsach"/>
-        <w:ind w:left="2160"/>
-      </w:pPr>
-    </w:p>
-    <w:p>
-      <w:pPr>
-        <w:pStyle w:val="oancuaDanhsach"/>
-        <w:numPr>
-          <w:ilvl w:val="0"/>
-          <w:numId w:val="27"/>
-        </w:numPr>
+      <w:r>
         <w:rPr>
           <w:b/>
           <w:bCs/>
           <w:sz w:val="28"/>
           <w:szCs w:val="28"/>
         </w:rPr>
-      </w:pPr>
-      <w:proofErr w:type="spellStart"/>
+        <w:t xml:space="preserve">Kiểm tra </w:t>
+      </w:r>
       <w:r>
         <w:rPr>
           <w:b/>
@@ -870,175 +1583,141 @@
           <w:sz w:val="28"/>
           <w:szCs w:val="28"/>
         </w:rPr>
-        <w:t>lib</w:t>
-      </w:r>
-      <w:proofErr w:type="spellEnd"/>
-    </w:p>
-    <w:p>
-      <w:pPr>
-        <w:pStyle w:val="oancuaDanhsach"/>
-        <w:ind w:left="1440"/>
-      </w:pPr>
-    </w:p>
-    <w:p>
-      <w:pPr>
-        <w:pStyle w:val="oancuaDanhsach"/>
-        <w:ind w:left="1440"/>
-      </w:pPr>
-      <w:r>
-        <w:t>Nơi cài đặt các thư viện</w:t>
-      </w:r>
-      <w:r>
-        <w:t xml:space="preserve"> </w:t>
-      </w:r>
-      <w:proofErr w:type="spellStart"/>
-      <w:r>
-        <w:t>Algorithm</w:t>
-      </w:r>
-      <w:proofErr w:type="spellEnd"/>
-      <w:r>
-        <w:t xml:space="preserve">, </w:t>
-      </w:r>
-      <w:proofErr w:type="spellStart"/>
-      <w:r>
-        <w:t>Hash</w:t>
-      </w:r>
-      <w:proofErr w:type="spellEnd"/>
-      <w:r>
-        <w:t xml:space="preserve"> </w:t>
-      </w:r>
-      <w:proofErr w:type="spellStart"/>
-      <w:r>
-        <w:t>Table</w:t>
-      </w:r>
-      <w:proofErr w:type="spellEnd"/>
-      <w:r>
-        <w:t xml:space="preserve">, </w:t>
-      </w:r>
-      <w:proofErr w:type="spellStart"/>
-      <w:r>
-        <w:t>Queue</w:t>
-      </w:r>
-      <w:proofErr w:type="spellEnd"/>
-      <w:r>
-        <w:t xml:space="preserve">, </w:t>
-      </w:r>
-      <w:proofErr w:type="spellStart"/>
-      <w:r>
-        <w:t>Priority</w:t>
-      </w:r>
-      <w:proofErr w:type="spellEnd"/>
-      <w:r>
-        <w:t xml:space="preserve"> </w:t>
-      </w:r>
-      <w:proofErr w:type="spellStart"/>
-      <w:r>
-        <w:t>Queue</w:t>
-      </w:r>
-      <w:proofErr w:type="spellEnd"/>
-      <w:r>
-        <w:t xml:space="preserve">, AVL </w:t>
-      </w:r>
-      <w:proofErr w:type="spellStart"/>
-      <w:r>
-        <w:t>Tree</w:t>
-      </w:r>
-      <w:proofErr w:type="spellEnd"/>
-      <w:r>
-        <w:t xml:space="preserve">, BST, </w:t>
-      </w:r>
-      <w:proofErr w:type="spellStart"/>
-      <w:r>
-        <w:t>Linked</w:t>
-      </w:r>
-      <w:proofErr w:type="spellEnd"/>
-      <w:r>
-        <w:t xml:space="preserve"> </w:t>
-      </w:r>
-      <w:proofErr w:type="spellStart"/>
-      <w:r>
-        <w:t>List</w:t>
-      </w:r>
-      <w:proofErr w:type="spellEnd"/>
-      <w:r>
-        <w:t xml:space="preserve">, </w:t>
-      </w:r>
-      <w:proofErr w:type="spellStart"/>
-      <w:r>
-        <w:t>Stack</w:t>
-      </w:r>
-      <w:proofErr w:type="spellEnd"/>
-      <w:r>
-        <w:t xml:space="preserve"> để sử dụng.</w:t>
-      </w:r>
-    </w:p>
-    <w:p>
-      <w:pPr>
-        <w:pStyle w:val="oancuaDanhsach"/>
-        <w:ind w:left="1440"/>
-      </w:pPr>
-    </w:p>
-    <w:p>
-      <w:pPr>
-        <w:pStyle w:val="oancuaDanhsach"/>
-        <w:numPr>
-          <w:ilvl w:val="0"/>
-          <w:numId w:val="27"/>
-        </w:numPr>
+        <w:t>một vài chức năng</w:t>
+      </w:r>
+      <w:r>
         <w:rPr>
           <w:b/>
           <w:bCs/>
           <w:sz w:val="28"/>
           <w:szCs w:val="28"/>
         </w:rPr>
-      </w:pPr>
-      <w:proofErr w:type="spellStart"/>
-      <w:r>
+        <w:t xml:space="preserve"> chức năng</w:t>
+      </w:r>
+    </w:p>
+    <w:p>
+      <w:pPr>
+        <w:pStyle w:val="oancuaDanhsach"/>
+        <w:ind w:left="1080"/>
         <w:rPr>
           <w:b/>
           <w:bCs/>
           <w:sz w:val="28"/>
           <w:szCs w:val="28"/>
         </w:rPr>
-        <w:t>models</w:t>
-      </w:r>
-      <w:proofErr w:type="spellEnd"/>
-    </w:p>
-    <w:p>
-      <w:pPr>
-        <w:pStyle w:val="oancuaDanhsach"/>
-        <w:ind w:left="1440"/>
-      </w:pPr>
-    </w:p>
-    <w:p>
-      <w:pPr>
-        <w:pStyle w:val="oancuaDanhsach"/>
-        <w:ind w:left="1440"/>
-      </w:pPr>
-      <w:r>
-        <w:t>Là nơi chứa các cấu trúc của một bệnh nhân (</w:t>
-      </w:r>
-      <w:proofErr w:type="spellStart"/>
-      <w:r>
-        <w:t>Patient</w:t>
-      </w:r>
-      <w:proofErr w:type="spellEnd"/>
-      <w:r>
-        <w:t>), một người khách tới để khám (</w:t>
-      </w:r>
-      <w:proofErr w:type="spellStart"/>
-      <w:r>
-        <w:t>VisitPatient</w:t>
-      </w:r>
-      <w:proofErr w:type="spellEnd"/>
-      <w:r>
-        <w:t>).</w:t>
-      </w:r>
-    </w:p>
-    <w:p>
-      <w:pPr>
-        <w:pStyle w:val="oancuaDanhsach"/>
-        <w:ind w:left="1440"/>
+      </w:pPr>
+    </w:p>
+    <w:p>
+      <w:pPr>
+        <w:pStyle w:val="oancuaDanhsach"/>
+        <w:ind w:left="1080"/>
+        <w:rPr>
+          <w:sz w:val="26"/>
+          <w:szCs w:val="26"/>
+        </w:rPr>
+      </w:pPr>
+      <w:r>
+        <w:rPr>
+          <w:sz w:val="26"/>
+          <w:szCs w:val="26"/>
+        </w:rPr>
+        <w:t>Cho file patient.txt đang chứa dữ liệu:</w:t>
+      </w:r>
+    </w:p>
+    <w:p>
+      <w:pPr>
+        <w:pStyle w:val="oancuaDanhsach"/>
+        <w:ind w:left="1800"/>
+      </w:pPr>
+      <w:r>
+        <w:t>25120204</w:t>
+      </w:r>
+    </w:p>
+    <w:p>
+      <w:pPr>
+        <w:pStyle w:val="oancuaDanhsach"/>
+        <w:ind w:left="1800"/>
+      </w:pPr>
+      <w:r>
+        <w:t>25120201|Bui Van Binh|18|CNTT|4|1|1000000</w:t>
+      </w:r>
+    </w:p>
+    <w:p>
+      <w:pPr>
+        <w:pStyle w:val="oancuaDanhsach"/>
+        <w:ind w:left="1800"/>
+      </w:pPr>
+      <w:r>
+        <w:t>25120202</w:t>
+      </w:r>
+      <w:r>
+        <w:t>|</w:t>
+      </w:r>
+      <w:r>
+        <w:t>Le Thanh Dat</w:t>
+      </w:r>
+      <w:r>
+        <w:t>|18|CNTT|</w:t>
+      </w:r>
+      <w:r>
+        <w:t>2</w:t>
+      </w:r>
+      <w:r>
+        <w:t>|</w:t>
+      </w:r>
+      <w:r>
+        <w:t>0</w:t>
+      </w:r>
+      <w:r>
+        <w:t>|</w:t>
+      </w:r>
+      <w:r>
+        <w:t>156</w:t>
+      </w:r>
+      <w:r>
+        <w:t>0000</w:t>
+      </w:r>
+    </w:p>
+    <w:p>
+      <w:pPr>
+        <w:pStyle w:val="oancuaDanhsach"/>
+        <w:ind w:left="1800"/>
+      </w:pPr>
+      <w:r>
+        <w:t>25120203</w:t>
+      </w:r>
+      <w:r>
+        <w:t>|</w:t>
+      </w:r>
+      <w:r>
+        <w:t>Nguyen Thi DSA</w:t>
+      </w:r>
+      <w:r>
+        <w:t>|18|CNTT|</w:t>
+      </w:r>
+      <w:r>
+        <w:t>3</w:t>
+      </w:r>
+      <w:r>
+        <w:t>|</w:t>
+      </w:r>
+      <w:r>
+        <w:t>1</w:t>
+      </w:r>
+      <w:r>
+        <w:t>|</w:t>
+      </w:r>
+      <w:r>
+        <w:t>29</w:t>
+      </w:r>
+      <w:r>
+        <w:t>00000</w:t>
+      </w:r>
+    </w:p>
+    <w:p>
+      <w:pPr>
+        <w:pStyle w:val="oancuaDanhsach"/>
+        <w:ind w:left="1080"/>
         <w:rPr>
           <w:b/>
           <w:bCs/>
@@ -1052,7 +1731,7 @@
         <w:pStyle w:val="oancuaDanhsach"/>
         <w:numPr>
           <w:ilvl w:val="0"/>
-          <w:numId w:val="27"/>
+          <w:numId w:val="39"/>
         </w:numPr>
         <w:rPr>
           <w:b/>
@@ -1061,7 +1740,6 @@
           <w:szCs w:val="28"/>
         </w:rPr>
       </w:pPr>
-      <w:proofErr w:type="spellStart"/>
       <w:r>
         <w:rPr>
           <w:b/>
@@ -1069,23 +1747,100 @@
           <w:sz w:val="28"/>
           <w:szCs w:val="28"/>
         </w:rPr>
-        <w:t>system</w:t>
-      </w:r>
-      <w:proofErr w:type="spellEnd"/>
-      <w:r>
+        <w:t>Testcase 1</w:t>
+      </w:r>
+    </w:p>
+    <w:p>
+      <w:pPr>
+        <w:pStyle w:val="oancuaDanhsach"/>
+        <w:ind w:left="1440"/>
         <w:rPr>
           <w:b/>
           <w:bCs/>
           <w:sz w:val="28"/>
           <w:szCs w:val="28"/>
         </w:rPr>
-        <w:t xml:space="preserve"> </w:t>
-      </w:r>
-    </w:p>
-    <w:p>
-      <w:pPr>
-        <w:pStyle w:val="oancuaDanhsach"/>
-        <w:ind w:left="1080"/>
+      </w:pPr>
+    </w:p>
+    <w:p>
+      <w:pPr>
+        <w:pStyle w:val="oancuaDanhsach"/>
+        <w:numPr>
+          <w:ilvl w:val="0"/>
+          <w:numId w:val="40"/>
+        </w:numPr>
+      </w:pPr>
+      <w:r>
+        <w:t>Đọc dữ</w:t>
+      </w:r>
+      <w:r>
+        <w:t xml:space="preserve"> liệu có trong file patient.txt:</w:t>
+      </w:r>
+    </w:p>
+    <w:p>
+      <w:pPr>
+        <w:pStyle w:val="oancuaDanhsach"/>
+        <w:ind w:left="1800"/>
+      </w:pPr>
+    </w:p>
+    <w:p>
+      <w:pPr>
+        <w:pStyle w:val="oancuaDanhsach"/>
+        <w:numPr>
+          <w:ilvl w:val="0"/>
+          <w:numId w:val="40"/>
+        </w:numPr>
+      </w:pPr>
+      <w:r>
+        <w:t>Kết quả: FileService đã đọc được file và thêm bệnh nhân vào trong danh sách bệnh nhân và</w:t>
+      </w:r>
+      <w:r>
+        <w:t xml:space="preserve"> bệnh nhân DSA và Binh vào</w:t>
+      </w:r>
+      <w:r>
+        <w:t xml:space="preserve"> danh sách ưu tiên (vì mức độ bệnh là </w:t>
+      </w:r>
+      <w:r>
+        <w:t>3 và 4</w:t>
+      </w:r>
+      <w:r>
+        <w:t>)</w:t>
+      </w:r>
+      <w:r>
+        <w:t xml:space="preserve"> và mã số bệnh nhân tiếp theo là 25120204 cũng được lấy ra để tiếp tục sử dụng</w:t>
+      </w:r>
+      <w:r>
+        <w:t>.</w:t>
+      </w:r>
+    </w:p>
+    <w:p>
+      <w:pPr>
+        <w:pStyle w:val="oancuaDanhsach"/>
+        <w:ind w:left="1800"/>
+      </w:pPr>
+    </w:p>
+    <w:p>
+      <w:pPr>
+        <w:pStyle w:val="oancuaDanhsach"/>
+        <w:ind w:left="1800"/>
+      </w:pPr>
+      <w:r>
+        <w:t>PASS</w:t>
+      </w:r>
+    </w:p>
+    <w:p>
+      <w:pPr>
+        <w:pStyle w:val="oancuaDanhsach"/>
+        <w:ind w:left="1800"/>
+      </w:pPr>
+    </w:p>
+    <w:p>
+      <w:pPr>
+        <w:pStyle w:val="oancuaDanhsach"/>
+        <w:numPr>
+          <w:ilvl w:val="0"/>
+          <w:numId w:val="39"/>
+        </w:numPr>
         <w:rPr>
           <w:b/>
           <w:bCs/>
@@ -1093,136 +1848,578 @@
           <w:szCs w:val="28"/>
         </w:rPr>
       </w:pPr>
-    </w:p>
-    <w:p>
-      <w:pPr>
-        <w:pStyle w:val="oancuaDanhsach"/>
-        <w:numPr>
-          <w:ilvl w:val="0"/>
-          <w:numId w:val="26"/>
-        </w:numPr>
-      </w:pPr>
-      <w:r>
-        <w:t>FileService.hpp: dùng để đọc dữ liệu</w:t>
-      </w:r>
-      <w:r>
-        <w:t xml:space="preserve"> và lưu dữ liệu của</w:t>
-      </w:r>
-      <w:r>
-        <w:t xml:space="preserve"> các bệnh nhân </w:t>
-      </w:r>
-      <w:r>
-        <w:t>vào</w:t>
-      </w:r>
-      <w:r>
-        <w:t xml:space="preserve"> trong </w:t>
-      </w:r>
-      <w:proofErr w:type="spellStart"/>
-      <w:r>
-        <w:t>file</w:t>
-      </w:r>
-      <w:proofErr w:type="spellEnd"/>
-      <w:r>
-        <w:t xml:space="preserve"> patient.txt.</w:t>
-      </w:r>
-    </w:p>
-    <w:p>
-      <w:pPr>
-        <w:pStyle w:val="oancuaDanhsach"/>
-        <w:numPr>
-          <w:ilvl w:val="0"/>
-          <w:numId w:val="26"/>
-        </w:numPr>
-      </w:pPr>
-      <w:r>
-        <w:t xml:space="preserve">PatientHashTable.hpp: dùng để quản lí các bệnh nhân trong hệ thống bệnh viện dưới dạng một bảng băm với kiểu dữ liệu </w:t>
-      </w:r>
-      <w:r>
-        <w:t>AVL như thêm, xóa, tìm kiếm, hiển thị bệnh nhân.</w:t>
-      </w:r>
-    </w:p>
-    <w:p>
-      <w:pPr>
-        <w:pStyle w:val="oancuaDanhsach"/>
-        <w:numPr>
-          <w:ilvl w:val="0"/>
-          <w:numId w:val="26"/>
-        </w:numPr>
-      </w:pPr>
-      <w:r>
-        <w:t>PatientService.hpp: là phần chịu trách nhiệm hiển thị khi thao tác và sử dụng các hàm trong PatientHashTable.hpp.</w:t>
-      </w:r>
-    </w:p>
-    <w:p>
-      <w:pPr>
-        <w:pStyle w:val="oancuaDanhsach"/>
-        <w:numPr>
-          <w:ilvl w:val="0"/>
-          <w:numId w:val="26"/>
-        </w:numPr>
-      </w:pPr>
-      <w:r>
-        <w:lastRenderedPageBreak/>
-        <w:t xml:space="preserve">VisitService.hpp: </w:t>
-      </w:r>
-      <w:r>
-        <w:t xml:space="preserve">quản lí hàng đợi bằng cấu trúc dữ liệu </w:t>
-      </w:r>
-      <w:proofErr w:type="spellStart"/>
-      <w:r>
-        <w:t>queue</w:t>
-      </w:r>
-      <w:proofErr w:type="spellEnd"/>
-      <w:r>
-        <w:t>.</w:t>
-      </w:r>
-    </w:p>
-    <w:p>
-      <w:pPr>
-        <w:pStyle w:val="oancuaDanhsach"/>
-        <w:numPr>
-          <w:ilvl w:val="0"/>
-          <w:numId w:val="26"/>
-        </w:numPr>
-      </w:pPr>
-      <w:r>
-        <w:t xml:space="preserve">EmergencyService.hpp: chịu trách nhiệm quản lí các bệnh nhân có mức độ bệnh cao (nặng và cấp cứu) với một biến </w:t>
-      </w:r>
-      <w:proofErr w:type="spellStart"/>
-      <w:r>
-        <w:t>priority</w:t>
-      </w:r>
-      <w:proofErr w:type="spellEnd"/>
-      <w:r>
-        <w:t xml:space="preserve"> </w:t>
-      </w:r>
-      <w:proofErr w:type="spellStart"/>
-      <w:r>
-        <w:t>queue</w:t>
-      </w:r>
-      <w:proofErr w:type="spellEnd"/>
-      <w:r>
-        <w:t xml:space="preserve"> được sử dụng trong hàm và sẽ được lưu trữ trong </w:t>
-      </w:r>
-      <w:proofErr w:type="spellStart"/>
-      <w:r>
-        <w:t>file</w:t>
-      </w:r>
-      <w:proofErr w:type="spellEnd"/>
-      <w:r>
-        <w:t>.</w:t>
-      </w:r>
-    </w:p>
-    <w:p>
-      <w:pPr>
-        <w:pStyle w:val="oancuaDanhsach"/>
-        <w:ind w:left="1080"/>
+      <w:r>
         <w:rPr>
           <w:b/>
           <w:bCs/>
           <w:sz w:val="28"/>
           <w:szCs w:val="28"/>
         </w:rPr>
+        <w:lastRenderedPageBreak/>
+        <w:t>Testcase 2</w:t>
+      </w:r>
+    </w:p>
+    <w:p>
+      <w:pPr>
+        <w:pStyle w:val="oancuaDanhsach"/>
+        <w:ind w:left="1440"/>
+        <w:rPr>
+          <w:b/>
+          <w:bCs/>
+          <w:sz w:val="28"/>
+          <w:szCs w:val="28"/>
+        </w:rPr>
+      </w:pPr>
+    </w:p>
+    <w:p>
+      <w:pPr>
+        <w:pStyle w:val="oancuaDanhsach"/>
+        <w:numPr>
+          <w:ilvl w:val="0"/>
+          <w:numId w:val="40"/>
+        </w:numPr>
+      </w:pPr>
+      <w:r>
+        <w:t>Hệ thống chưa có bệnh nhân nào, nhập dữ liệu:</w:t>
+      </w:r>
+    </w:p>
+    <w:p>
+      <w:pPr>
+        <w:pStyle w:val="oancuaDanhsach"/>
+        <w:numPr>
+          <w:ilvl w:val="0"/>
+          <w:numId w:val="41"/>
+        </w:numPr>
+      </w:pPr>
+      <w:r>
+        <w:t>Ten benh nhan</w:t>
+      </w:r>
+      <w:r>
+        <w:t xml:space="preserve">: </w:t>
+      </w:r>
+      <w:r>
+        <w:t>Bui Van Binh</w:t>
+      </w:r>
+    </w:p>
+    <w:p>
+      <w:pPr>
+        <w:pStyle w:val="oancuaDanhsach"/>
+        <w:numPr>
+          <w:ilvl w:val="0"/>
+          <w:numId w:val="41"/>
+        </w:numPr>
+      </w:pPr>
+      <w:r>
+        <w:t>Tuoi</w:t>
+      </w:r>
+      <w:r>
+        <w:t>: 18</w:t>
+      </w:r>
+    </w:p>
+    <w:p>
+      <w:pPr>
+        <w:pStyle w:val="oancuaDanhsach"/>
+        <w:numPr>
+          <w:ilvl w:val="0"/>
+          <w:numId w:val="41"/>
+        </w:numPr>
+      </w:pPr>
+      <w:r>
+        <w:t>Khoa: CNTT</w:t>
+      </w:r>
+    </w:p>
+    <w:p>
+      <w:pPr>
+        <w:pStyle w:val="oancuaDanhsach"/>
+        <w:numPr>
+          <w:ilvl w:val="0"/>
+          <w:numId w:val="41"/>
+        </w:numPr>
+      </w:pPr>
+      <w:r>
+        <w:t>Muc do benh</w:t>
+      </w:r>
+      <w:r>
+        <w:t>: 4</w:t>
+      </w:r>
+    </w:p>
+    <w:p>
+      <w:pPr>
+        <w:pStyle w:val="oancuaDanhsach"/>
+        <w:numPr>
+          <w:ilvl w:val="0"/>
+          <w:numId w:val="41"/>
+        </w:numPr>
+      </w:pPr>
+      <w:r>
+        <w:t>Bao hiem:</w:t>
+      </w:r>
+      <w:r>
+        <w:t xml:space="preserve"> 1 (có)</w:t>
+      </w:r>
+    </w:p>
+    <w:p>
+      <w:pPr>
+        <w:pStyle w:val="oancuaDanhsach"/>
+        <w:numPr>
+          <w:ilvl w:val="0"/>
+          <w:numId w:val="41"/>
+        </w:numPr>
+      </w:pPr>
+      <w:r>
+        <w:t>Vien phi</w:t>
+      </w:r>
+      <w:r>
+        <w:t>:</w:t>
+      </w:r>
+      <w:r>
+        <w:t xml:space="preserve"> 1000000</w:t>
+      </w:r>
+    </w:p>
+    <w:p>
+      <w:pPr>
+        <w:pStyle w:val="oancuaDanhsach"/>
+        <w:ind w:left="2520"/>
+      </w:pPr>
+    </w:p>
+    <w:p>
+      <w:pPr>
+        <w:pStyle w:val="oancuaDanhsach"/>
+        <w:numPr>
+          <w:ilvl w:val="0"/>
+          <w:numId w:val="40"/>
+        </w:numPr>
+      </w:pPr>
+      <w:r>
+        <w:t>Kết quả: Bệnh nhân đã được thêm vào danh sách với mã số bệnh nhân được chương trình cho 1 cách tự động.</w:t>
+      </w:r>
+    </w:p>
+    <w:p>
+      <w:pPr>
+        <w:pStyle w:val="oancuaDanhsach"/>
+        <w:ind w:left="1800"/>
+      </w:pPr>
+    </w:p>
+    <w:p>
+      <w:pPr>
+        <w:pStyle w:val="oancuaDanhsach"/>
+        <w:ind w:left="1800"/>
+      </w:pPr>
+      <w:r>
+        <w:t>PASS</w:t>
+      </w:r>
+    </w:p>
+    <w:p>
+      <w:pPr>
+        <w:pStyle w:val="oancuaDanhsach"/>
+        <w:ind w:left="1800"/>
+      </w:pPr>
+    </w:p>
+    <w:p>
+      <w:pPr>
+        <w:pStyle w:val="oancuaDanhsach"/>
+        <w:numPr>
+          <w:ilvl w:val="0"/>
+          <w:numId w:val="39"/>
+        </w:numPr>
+        <w:rPr>
+          <w:b/>
+          <w:bCs/>
+          <w:sz w:val="28"/>
+          <w:szCs w:val="28"/>
+        </w:rPr>
+      </w:pPr>
+      <w:r>
+        <w:rPr>
+          <w:b/>
+          <w:bCs/>
+          <w:sz w:val="28"/>
+          <w:szCs w:val="28"/>
+        </w:rPr>
+        <w:t>Testcase 3</w:t>
+      </w:r>
+    </w:p>
+    <w:p>
+      <w:pPr>
+        <w:pStyle w:val="oancuaDanhsach"/>
+        <w:ind w:left="1440"/>
+        <w:rPr>
+          <w:b/>
+          <w:bCs/>
+          <w:sz w:val="28"/>
+          <w:szCs w:val="28"/>
+        </w:rPr>
+      </w:pPr>
+    </w:p>
+    <w:p>
+      <w:pPr>
+        <w:pStyle w:val="oancuaDanhsach"/>
+        <w:numPr>
+          <w:ilvl w:val="0"/>
+          <w:numId w:val="40"/>
+        </w:numPr>
+      </w:pPr>
+      <w:r>
+        <w:t>Tìm kiếm bệnh nhân có mã 25120288</w:t>
+      </w:r>
+    </w:p>
+    <w:p>
+      <w:pPr>
+        <w:pStyle w:val="oancuaDanhsach"/>
+        <w:ind w:left="1800"/>
+      </w:pPr>
+    </w:p>
+    <w:p>
+      <w:pPr>
+        <w:pStyle w:val="oancuaDanhsach"/>
+        <w:numPr>
+          <w:ilvl w:val="0"/>
+          <w:numId w:val="40"/>
+        </w:numPr>
+      </w:pPr>
+      <w:r>
+        <w:t>Kết quả: Khong tim thay benh nhan co ma: 25120288</w:t>
+      </w:r>
+    </w:p>
+    <w:p>
+      <w:pPr>
+        <w:pStyle w:val="oancuaDanhsach"/>
+        <w:ind w:left="1800"/>
+      </w:pPr>
+    </w:p>
+    <w:p>
+      <w:pPr>
+        <w:pStyle w:val="oancuaDanhsach"/>
+        <w:ind w:left="1800"/>
+      </w:pPr>
+      <w:r>
+        <w:t>PASS</w:t>
+      </w:r>
+    </w:p>
+    <w:p>
+      <w:pPr>
+        <w:pStyle w:val="oancuaDanhsach"/>
+        <w:ind w:left="1440"/>
+        <w:rPr>
+          <w:b/>
+          <w:bCs/>
+          <w:sz w:val="28"/>
+          <w:szCs w:val="28"/>
+        </w:rPr>
+      </w:pPr>
+    </w:p>
+    <w:p>
+      <w:pPr>
+        <w:pStyle w:val="oancuaDanhsach"/>
+        <w:numPr>
+          <w:ilvl w:val="0"/>
+          <w:numId w:val="39"/>
+        </w:numPr>
+        <w:rPr>
+          <w:b/>
+          <w:bCs/>
+          <w:sz w:val="28"/>
+          <w:szCs w:val="28"/>
+        </w:rPr>
+      </w:pPr>
+      <w:r>
+        <w:rPr>
+          <w:b/>
+          <w:bCs/>
+          <w:sz w:val="28"/>
+          <w:szCs w:val="28"/>
+        </w:rPr>
+        <w:t>Testcase 4</w:t>
+      </w:r>
+    </w:p>
+    <w:p>
+      <w:pPr>
+        <w:pStyle w:val="oancuaDanhsach"/>
+        <w:ind w:left="1440"/>
+        <w:rPr>
+          <w:b/>
+          <w:bCs/>
+          <w:sz w:val="28"/>
+          <w:szCs w:val="28"/>
+        </w:rPr>
+      </w:pPr>
+    </w:p>
+    <w:p>
+      <w:pPr>
+        <w:pStyle w:val="oancuaDanhsach"/>
+        <w:numPr>
+          <w:ilvl w:val="0"/>
+          <w:numId w:val="40"/>
+        </w:numPr>
+      </w:pPr>
+      <w:r>
+        <w:t>Xóa bệnh nhân có mã 25120288</w:t>
+      </w:r>
+    </w:p>
+    <w:p>
+      <w:pPr>
+        <w:pStyle w:val="oancuaDanhsach"/>
+        <w:ind w:left="1800"/>
+      </w:pPr>
+    </w:p>
+    <w:p>
+      <w:pPr>
+        <w:pStyle w:val="oancuaDanhsach"/>
+        <w:numPr>
+          <w:ilvl w:val="0"/>
+          <w:numId w:val="40"/>
+        </w:numPr>
+      </w:pPr>
+      <w:r>
+        <w:t>Kết quả: Khong tim thay benh nhan</w:t>
+      </w:r>
+    </w:p>
+    <w:p>
+      <w:pPr>
+        <w:pStyle w:val="oancuaDanhsach"/>
+      </w:pPr>
+    </w:p>
+    <w:p>
+      <w:pPr>
+        <w:pStyle w:val="oancuaDanhsach"/>
+        <w:ind w:left="1800"/>
+      </w:pPr>
+      <w:r>
+        <w:t>PASS</w:t>
+      </w:r>
+    </w:p>
+    <w:p>
+      <w:pPr>
+        <w:pStyle w:val="oancuaDanhsach"/>
+        <w:ind w:left="1440"/>
+        <w:rPr>
+          <w:b/>
+          <w:bCs/>
+          <w:sz w:val="28"/>
+          <w:szCs w:val="28"/>
+        </w:rPr>
+      </w:pPr>
+    </w:p>
+    <w:p>
+      <w:pPr>
+        <w:pStyle w:val="oancuaDanhsach"/>
+        <w:numPr>
+          <w:ilvl w:val="0"/>
+          <w:numId w:val="39"/>
+        </w:numPr>
+        <w:rPr>
+          <w:b/>
+          <w:bCs/>
+          <w:sz w:val="28"/>
+          <w:szCs w:val="28"/>
+        </w:rPr>
+      </w:pPr>
+      <w:r>
+        <w:rPr>
+          <w:b/>
+          <w:bCs/>
+          <w:sz w:val="28"/>
+          <w:szCs w:val="28"/>
+        </w:rPr>
+        <w:t>Testcase 5</w:t>
+      </w:r>
+    </w:p>
+    <w:p>
+      <w:pPr>
+        <w:pStyle w:val="oancuaDanhsach"/>
+        <w:ind w:left="1440"/>
+        <w:rPr>
+          <w:b/>
+          <w:bCs/>
+          <w:sz w:val="28"/>
+          <w:szCs w:val="28"/>
+        </w:rPr>
+      </w:pPr>
+    </w:p>
+    <w:p>
+      <w:pPr>
+        <w:pStyle w:val="oancuaDanhsach"/>
+        <w:numPr>
+          <w:ilvl w:val="0"/>
+          <w:numId w:val="40"/>
+        </w:numPr>
+      </w:pPr>
+      <w:r>
+        <w:t>Xử lí bệnh nhân ưu tiên nhất</w:t>
+      </w:r>
+    </w:p>
+    <w:p>
+      <w:pPr>
+        <w:pStyle w:val="oancuaDanhsach"/>
+        <w:ind w:left="1800"/>
+      </w:pPr>
+    </w:p>
+    <w:p>
+      <w:pPr>
+        <w:pStyle w:val="oancuaDanhsach"/>
+        <w:numPr>
+          <w:ilvl w:val="0"/>
+          <w:numId w:val="40"/>
+        </w:numPr>
+      </w:pPr>
+      <w:r>
+        <w:t>Kết quả: bệnh nhân Binh được xử lí và xóa ra khỏi danh sách ưu tiên (vì mức độ 4 nguy cấp hơn mức độ 3)</w:t>
+      </w:r>
+    </w:p>
+    <w:p>
+      <w:pPr>
+        <w:pStyle w:val="oancuaDanhsach"/>
+      </w:pPr>
+    </w:p>
+    <w:p>
+      <w:pPr>
+        <w:pStyle w:val="oancuaDanhsach"/>
+        <w:ind w:left="1800"/>
+      </w:pPr>
+      <w:r>
+        <w:t>PASS</w:t>
+      </w:r>
+    </w:p>
+    <w:p>
+      <w:pPr>
+        <w:pStyle w:val="oancuaDanhsach"/>
+        <w:ind w:left="1440"/>
+        <w:rPr>
+          <w:b/>
+          <w:bCs/>
+          <w:sz w:val="28"/>
+          <w:szCs w:val="28"/>
+        </w:rPr>
+      </w:pPr>
+    </w:p>
+    <w:p>
+      <w:pPr>
+        <w:pStyle w:val="oancuaDanhsach"/>
+        <w:numPr>
+          <w:ilvl w:val="0"/>
+          <w:numId w:val="39"/>
+        </w:numPr>
+        <w:rPr>
+          <w:b/>
+          <w:bCs/>
+          <w:sz w:val="28"/>
+          <w:szCs w:val="28"/>
+        </w:rPr>
+      </w:pPr>
+      <w:r>
+        <w:rPr>
+          <w:b/>
+          <w:bCs/>
+          <w:sz w:val="28"/>
+          <w:szCs w:val="28"/>
+        </w:rPr>
+        <w:t>Testcase 6</w:t>
+      </w:r>
+    </w:p>
+    <w:p>
+      <w:pPr>
+        <w:pStyle w:val="oancuaDanhsach"/>
+        <w:numPr>
+          <w:ilvl w:val="0"/>
+          <w:numId w:val="40"/>
+        </w:numPr>
+      </w:pPr>
+      <w:r>
+        <w:lastRenderedPageBreak/>
+        <w:t>Nhập dữ liệu đăng kí khám:</w:t>
+      </w:r>
+    </w:p>
+    <w:p>
+      <w:pPr>
+        <w:pStyle w:val="oancuaDanhsach"/>
+        <w:numPr>
+          <w:ilvl w:val="0"/>
+          <w:numId w:val="42"/>
+        </w:numPr>
+      </w:pPr>
+      <w:r>
+        <w:t>Nhap ma dang ky kham: DSA25</w:t>
+      </w:r>
+    </w:p>
+    <w:p>
+      <w:pPr>
+        <w:pStyle w:val="oancuaDanhsach"/>
+        <w:numPr>
+          <w:ilvl w:val="0"/>
+          <w:numId w:val="42"/>
+        </w:numPr>
+      </w:pPr>
+      <w:r>
+        <w:t>Nhap ho ten benh nhan: Le Thanh Dat</w:t>
+      </w:r>
+    </w:p>
+    <w:p>
+      <w:pPr>
+        <w:pStyle w:val="oancuaDanhsach"/>
+        <w:numPr>
+          <w:ilvl w:val="0"/>
+          <w:numId w:val="42"/>
+        </w:numPr>
+      </w:pPr>
+      <w:r>
+        <w:t>Nhap tuoi: 19</w:t>
+      </w:r>
+    </w:p>
+    <w:p>
+      <w:pPr>
+        <w:pStyle w:val="oancuaDanhsach"/>
+        <w:numPr>
+          <w:ilvl w:val="0"/>
+          <w:numId w:val="42"/>
+        </w:numPr>
+      </w:pPr>
+      <w:r>
+        <w:t>Nhap ten phong kham: 25CTT4</w:t>
+      </w:r>
+    </w:p>
+    <w:p>
+      <w:pPr>
+        <w:pStyle w:val="oancuaDanhsach"/>
+        <w:ind w:left="2520"/>
+      </w:pPr>
+    </w:p>
+    <w:p>
+      <w:pPr>
+        <w:pStyle w:val="oancuaDanhsach"/>
+        <w:numPr>
+          <w:ilvl w:val="0"/>
+          <w:numId w:val="40"/>
+        </w:numPr>
+      </w:pPr>
+      <w:r>
+        <w:t>Kết quả: khách hàng Le Thanh Dat được thêm vào danh sách chờ để tiến hành khám.</w:t>
+      </w:r>
+    </w:p>
+    <w:p>
+      <w:pPr>
+        <w:pStyle w:val="oancuaDanhsach"/>
+        <w:ind w:left="1800"/>
+      </w:pPr>
+    </w:p>
+    <w:p>
+      <w:pPr>
+        <w:pStyle w:val="oancuaDanhsach"/>
+        <w:ind w:left="1800"/>
+      </w:pPr>
+      <w:r>
+        <w:t>PASS</w:t>
+      </w:r>
+    </w:p>
+    <w:p>
+      <w:pPr>
+        <w:pStyle w:val="oancuaDanhsach"/>
+        <w:ind w:left="1080"/>
+        <w:rPr>
+          <w:b/>
+          <w:bCs/>
+          <w:sz w:val="28"/>
+          <w:szCs w:val="28"/>
+        </w:rPr>
       </w:pPr>
     </w:p>
     <w:p>
@@ -1246,674 +2443,22 @@
           <w:sz w:val="28"/>
           <w:szCs w:val="28"/>
         </w:rPr>
-        <w:t>Luồng hoạt động của chương trình</w:t>
+        <w:t>Tổng kết</w:t>
       </w:r>
     </w:p>
     <w:p>
       <w:pPr>
         <w:pStyle w:val="oancuaDanhsach"/>
         <w:ind w:left="1080"/>
-        <w:rPr>
-          <w:b/>
-          <w:bCs/>
-          <w:sz w:val="28"/>
-          <w:szCs w:val="28"/>
-        </w:rPr>
-      </w:pPr>
-    </w:p>
-    <w:p>
-      <w:pPr>
-        <w:pStyle w:val="oancuaDanhsach"/>
-        <w:numPr>
-          <w:ilvl w:val="0"/>
-          <w:numId w:val="29"/>
-        </w:numPr>
-        <w:rPr>
-          <w:sz w:val="26"/>
-          <w:szCs w:val="26"/>
-        </w:rPr>
-      </w:pPr>
-      <w:r>
-        <w:rPr>
-          <w:sz w:val="26"/>
-          <w:szCs w:val="26"/>
-        </w:rPr>
-        <w:t>Người đùng khởi động chương trình</w:t>
-      </w:r>
-    </w:p>
-    <w:p>
-      <w:pPr>
-        <w:pStyle w:val="oancuaDanhsach"/>
-        <w:ind w:left="1440"/>
-        <w:rPr>
-          <w:sz w:val="26"/>
-          <w:szCs w:val="26"/>
-        </w:rPr>
-      </w:pPr>
-    </w:p>
-    <w:p>
-      <w:pPr>
-        <w:pStyle w:val="oancuaDanhsach"/>
-        <w:numPr>
-          <w:ilvl w:val="0"/>
-          <w:numId w:val="29"/>
-        </w:numPr>
-        <w:rPr>
-          <w:sz w:val="26"/>
-          <w:szCs w:val="26"/>
-        </w:rPr>
-      </w:pPr>
-      <w:r>
-        <w:rPr>
-          <w:sz w:val="26"/>
-          <w:szCs w:val="26"/>
-        </w:rPr>
-        <w:t>Chương trình bắt đầu</w:t>
-      </w:r>
-      <w:r>
-        <w:rPr>
-          <w:sz w:val="26"/>
-          <w:szCs w:val="26"/>
-        </w:rPr>
-        <w:t xml:space="preserve"> chạy và đọc dữ liệu từ patient.txt nhờ </w:t>
-      </w:r>
-      <w:proofErr w:type="spellStart"/>
-      <w:r>
-        <w:rPr>
-          <w:sz w:val="26"/>
-          <w:szCs w:val="26"/>
-        </w:rPr>
-        <w:t>FileService</w:t>
-      </w:r>
-      <w:proofErr w:type="spellEnd"/>
-    </w:p>
-    <w:p>
-      <w:pPr>
-        <w:pStyle w:val="oancuaDanhsach"/>
-        <w:rPr>
-          <w:sz w:val="26"/>
-          <w:szCs w:val="26"/>
-        </w:rPr>
-      </w:pPr>
-    </w:p>
-    <w:p>
-      <w:pPr>
-        <w:pStyle w:val="oancuaDanhsach"/>
-        <w:numPr>
-          <w:ilvl w:val="0"/>
-          <w:numId w:val="29"/>
-        </w:numPr>
-        <w:rPr>
-          <w:sz w:val="26"/>
-          <w:szCs w:val="26"/>
-        </w:rPr>
-      </w:pPr>
-      <w:proofErr w:type="spellStart"/>
-      <w:r>
-        <w:rPr>
-          <w:sz w:val="26"/>
-          <w:szCs w:val="26"/>
-        </w:rPr>
-        <w:t>Menu</w:t>
-      </w:r>
-      <w:proofErr w:type="spellEnd"/>
-      <w:r>
-        <w:rPr>
-          <w:sz w:val="26"/>
-          <w:szCs w:val="26"/>
-        </w:rPr>
-        <w:t xml:space="preserve"> chính của ứng dụng được hiển thị và cho phép lựa chọn thao tác</w:t>
-      </w:r>
-    </w:p>
-    <w:p>
-      <w:pPr>
-        <w:pStyle w:val="oancuaDanhsach"/>
-        <w:rPr>
-          <w:sz w:val="26"/>
-          <w:szCs w:val="26"/>
-        </w:rPr>
-      </w:pPr>
-    </w:p>
-    <w:p>
-      <w:pPr>
-        <w:pStyle w:val="oancuaDanhsach"/>
-        <w:numPr>
-          <w:ilvl w:val="0"/>
-          <w:numId w:val="29"/>
-        </w:numPr>
-        <w:rPr>
-          <w:sz w:val="26"/>
-          <w:szCs w:val="26"/>
-        </w:rPr>
-      </w:pPr>
-      <w:r>
-        <w:rPr>
-          <w:sz w:val="26"/>
-          <w:szCs w:val="26"/>
-        </w:rPr>
-        <w:t>Nếu chọn quản lí bệnh nhân sẽ có thực hiện:</w:t>
-      </w:r>
-    </w:p>
-    <w:p>
-      <w:pPr>
-        <w:pStyle w:val="oancuaDanhsach"/>
-        <w:rPr>
-          <w:sz w:val="26"/>
-          <w:szCs w:val="26"/>
-        </w:rPr>
-      </w:pPr>
-    </w:p>
-    <w:p>
-      <w:pPr>
-        <w:pStyle w:val="oancuaDanhsach"/>
-        <w:numPr>
-          <w:ilvl w:val="0"/>
-          <w:numId w:val="33"/>
-        </w:numPr>
-      </w:pPr>
-      <w:r>
-        <w:t>Thêm bệnh nhân mới.</w:t>
-      </w:r>
-    </w:p>
-    <w:p>
-      <w:pPr>
-        <w:pStyle w:val="oancuaDanhsach"/>
-        <w:numPr>
-          <w:ilvl w:val="0"/>
-          <w:numId w:val="33"/>
-        </w:numPr>
-      </w:pPr>
-      <w:r>
-        <w:t>Tìm bệnh nhân.</w:t>
-      </w:r>
-    </w:p>
-    <w:p>
-      <w:pPr>
-        <w:pStyle w:val="oancuaDanhsach"/>
-        <w:numPr>
-          <w:ilvl w:val="0"/>
-          <w:numId w:val="33"/>
-        </w:numPr>
-      </w:pPr>
-      <w:r>
-        <w:t>Xóa bệnh nhân khỏi danh sách.</w:t>
-      </w:r>
-    </w:p>
-    <w:p>
-      <w:pPr>
-        <w:pStyle w:val="oancuaDanhsach"/>
-        <w:numPr>
-          <w:ilvl w:val="0"/>
-          <w:numId w:val="33"/>
-        </w:numPr>
-      </w:pPr>
-      <w:r>
-        <w:t xml:space="preserve">Quay lại </w:t>
-      </w:r>
-      <w:proofErr w:type="spellStart"/>
-      <w:r>
-        <w:t>menu</w:t>
-      </w:r>
-      <w:proofErr w:type="spellEnd"/>
-      <w:r>
-        <w:t xml:space="preserve"> chính.</w:t>
-      </w:r>
-    </w:p>
-    <w:p>
-      <w:pPr>
-        <w:pStyle w:val="oancuaDanhsach"/>
-        <w:ind w:left="2232"/>
-      </w:pPr>
-    </w:p>
-    <w:p>
-      <w:pPr>
-        <w:pStyle w:val="oancuaDanhsach"/>
-        <w:numPr>
-          <w:ilvl w:val="0"/>
-          <w:numId w:val="29"/>
-        </w:numPr>
-        <w:rPr>
-          <w:sz w:val="26"/>
-          <w:szCs w:val="26"/>
-        </w:rPr>
-      </w:pPr>
-      <w:r>
-        <w:rPr>
-          <w:sz w:val="26"/>
-          <w:szCs w:val="26"/>
-        </w:rPr>
-        <w:t>Nếu chọn đăng kí khám sẽ có thể thực hiện:</w:t>
-      </w:r>
-    </w:p>
-    <w:p>
-      <w:pPr>
-        <w:pStyle w:val="oancuaDanhsach"/>
-        <w:ind w:left="1440"/>
-        <w:rPr>
-          <w:sz w:val="26"/>
-          <w:szCs w:val="26"/>
-        </w:rPr>
-      </w:pPr>
-    </w:p>
-    <w:p>
-      <w:pPr>
-        <w:pStyle w:val="oancuaDanhsach"/>
-        <w:numPr>
-          <w:ilvl w:val="0"/>
-          <w:numId w:val="33"/>
-        </w:numPr>
-        <w:rPr>
-          <w:sz w:val="26"/>
-          <w:szCs w:val="26"/>
-        </w:rPr>
-      </w:pPr>
-      <w:r>
-        <w:rPr>
-          <w:sz w:val="26"/>
-          <w:szCs w:val="26"/>
-        </w:rPr>
-        <w:t>Đăng kí khám.</w:t>
-      </w:r>
-    </w:p>
-    <w:p>
-      <w:pPr>
-        <w:pStyle w:val="oancuaDanhsach"/>
-        <w:numPr>
-          <w:ilvl w:val="0"/>
-          <w:numId w:val="33"/>
-        </w:numPr>
-        <w:rPr>
-          <w:sz w:val="26"/>
-          <w:szCs w:val="26"/>
-        </w:rPr>
-      </w:pPr>
-      <w:r>
-        <w:rPr>
-          <w:sz w:val="26"/>
-          <w:szCs w:val="26"/>
-        </w:rPr>
-        <w:t>Gọi bệnh nhân tiếp theo và xóa khỏi danh sách.</w:t>
-      </w:r>
-    </w:p>
-    <w:p>
-      <w:pPr>
-        <w:pStyle w:val="oancuaDanhsach"/>
-        <w:numPr>
-          <w:ilvl w:val="0"/>
-          <w:numId w:val="33"/>
-        </w:numPr>
-        <w:rPr>
-          <w:sz w:val="26"/>
-          <w:szCs w:val="26"/>
-        </w:rPr>
-      </w:pPr>
-      <w:r>
-        <w:rPr>
-          <w:sz w:val="26"/>
-          <w:szCs w:val="26"/>
-        </w:rPr>
-        <w:t>Xem thông tin bệnh nhân đầu hàng chờ và số lượng khách đang chờ.</w:t>
-      </w:r>
-    </w:p>
-    <w:p>
-      <w:pPr>
-        <w:pStyle w:val="oancuaDanhsach"/>
-        <w:numPr>
-          <w:ilvl w:val="0"/>
-          <w:numId w:val="33"/>
-        </w:numPr>
-        <w:rPr>
-          <w:sz w:val="26"/>
-          <w:szCs w:val="26"/>
-        </w:rPr>
-      </w:pPr>
-      <w:r>
-        <w:rPr>
-          <w:sz w:val="26"/>
-          <w:szCs w:val="26"/>
-        </w:rPr>
-        <w:t xml:space="preserve">Quay lại </w:t>
-      </w:r>
-      <w:proofErr w:type="spellStart"/>
-      <w:r>
-        <w:rPr>
-          <w:sz w:val="26"/>
-          <w:szCs w:val="26"/>
-        </w:rPr>
-        <w:t>menu</w:t>
-      </w:r>
-      <w:proofErr w:type="spellEnd"/>
-      <w:r>
-        <w:rPr>
-          <w:sz w:val="26"/>
-          <w:szCs w:val="26"/>
-        </w:rPr>
-        <w:t xml:space="preserve"> chính.</w:t>
-      </w:r>
-    </w:p>
-    <w:p>
-      <w:pPr>
-        <w:pStyle w:val="oancuaDanhsach"/>
-        <w:ind w:left="2232"/>
-        <w:rPr>
-          <w:sz w:val="26"/>
-          <w:szCs w:val="26"/>
-        </w:rPr>
-      </w:pPr>
-    </w:p>
-    <w:p>
-      <w:pPr>
-        <w:pStyle w:val="oancuaDanhsach"/>
-        <w:numPr>
-          <w:ilvl w:val="0"/>
-          <w:numId w:val="29"/>
-        </w:numPr>
-        <w:rPr>
-          <w:sz w:val="26"/>
-          <w:szCs w:val="26"/>
-        </w:rPr>
-      </w:pPr>
-      <w:r>
-        <w:rPr>
-          <w:sz w:val="26"/>
-          <w:szCs w:val="26"/>
-        </w:rPr>
-        <w:t>Nếu chọn quản lí cấp cứu sẽ có thể thực hiện:</w:t>
-      </w:r>
-    </w:p>
-    <w:p>
-      <w:pPr>
-        <w:pStyle w:val="oancuaDanhsach"/>
-        <w:ind w:left="2160"/>
-        <w:rPr>
-          <w:sz w:val="26"/>
-          <w:szCs w:val="26"/>
-        </w:rPr>
-      </w:pPr>
-    </w:p>
-    <w:p>
-      <w:pPr>
-        <w:pStyle w:val="oancuaDanhsach"/>
-        <w:numPr>
-          <w:ilvl w:val="0"/>
-          <w:numId w:val="33"/>
-        </w:numPr>
-        <w:rPr>
-          <w:sz w:val="26"/>
-          <w:szCs w:val="26"/>
-        </w:rPr>
-      </w:pPr>
-      <w:r>
-        <w:rPr>
-          <w:sz w:val="26"/>
-          <w:szCs w:val="26"/>
-        </w:rPr>
-        <w:t>Xử lí các bệnh nhân đang có mức độ bệnh cao nhất trước.</w:t>
-      </w:r>
-    </w:p>
-    <w:p>
-      <w:pPr>
-        <w:pStyle w:val="oancuaDanhsach"/>
-        <w:numPr>
-          <w:ilvl w:val="0"/>
-          <w:numId w:val="33"/>
-        </w:numPr>
-        <w:rPr>
-          <w:sz w:val="26"/>
-          <w:szCs w:val="26"/>
-        </w:rPr>
-      </w:pPr>
-      <w:r>
-        <w:rPr>
-          <w:sz w:val="26"/>
-          <w:szCs w:val="26"/>
-        </w:rPr>
-        <w:t>Xem thông tin bệnh nhân ưu tiên cao nhất và số lượng bệnh nhân đang có trong danh sách ưu tiên.</w:t>
-      </w:r>
-    </w:p>
-    <w:p>
-      <w:pPr>
-        <w:pStyle w:val="oancuaDanhsach"/>
-        <w:numPr>
-          <w:ilvl w:val="0"/>
-          <w:numId w:val="33"/>
-        </w:numPr>
-        <w:rPr>
-          <w:sz w:val="26"/>
-          <w:szCs w:val="26"/>
-        </w:rPr>
-      </w:pPr>
-      <w:r>
-        <w:rPr>
-          <w:sz w:val="26"/>
-          <w:szCs w:val="26"/>
-        </w:rPr>
-        <w:t xml:space="preserve">Quay lại </w:t>
-      </w:r>
-      <w:proofErr w:type="spellStart"/>
-      <w:r>
-        <w:rPr>
-          <w:sz w:val="26"/>
-          <w:szCs w:val="26"/>
-        </w:rPr>
-        <w:t>menu</w:t>
-      </w:r>
-      <w:proofErr w:type="spellEnd"/>
-      <w:r>
-        <w:rPr>
-          <w:sz w:val="26"/>
-          <w:szCs w:val="26"/>
-        </w:rPr>
-        <w:t xml:space="preserve"> chính</w:t>
-      </w:r>
-    </w:p>
-    <w:p>
-      <w:pPr>
-        <w:pStyle w:val="oancuaDanhsach"/>
-        <w:ind w:left="2232"/>
-        <w:rPr>
-          <w:sz w:val="26"/>
-          <w:szCs w:val="26"/>
-        </w:rPr>
-      </w:pPr>
-    </w:p>
-    <w:p>
-      <w:pPr>
-        <w:pStyle w:val="oancuaDanhsach"/>
-        <w:numPr>
-          <w:ilvl w:val="0"/>
-          <w:numId w:val="29"/>
-        </w:numPr>
-        <w:rPr>
-          <w:sz w:val="26"/>
-          <w:szCs w:val="26"/>
-        </w:rPr>
-      </w:pPr>
-      <w:r>
-        <w:rPr>
-          <w:sz w:val="26"/>
-          <w:szCs w:val="26"/>
-        </w:rPr>
-        <w:t>Khi thoát chương trình:</w:t>
-      </w:r>
-    </w:p>
-    <w:p>
-      <w:pPr>
-        <w:pStyle w:val="oancuaDanhsach"/>
-        <w:ind w:left="1440"/>
-        <w:rPr>
-          <w:sz w:val="26"/>
-          <w:szCs w:val="26"/>
-        </w:rPr>
-      </w:pPr>
-    </w:p>
-    <w:p>
-      <w:pPr>
-        <w:pStyle w:val="oancuaDanhsach"/>
-        <w:ind w:left="1440"/>
-        <w:rPr>
-          <w:sz w:val="26"/>
-          <w:szCs w:val="26"/>
-        </w:rPr>
-      </w:pPr>
-      <w:proofErr w:type="spellStart"/>
-      <w:r>
-        <w:rPr>
-          <w:sz w:val="26"/>
-          <w:szCs w:val="26"/>
-        </w:rPr>
-        <w:lastRenderedPageBreak/>
-        <w:t>FileService</w:t>
-      </w:r>
-      <w:proofErr w:type="spellEnd"/>
-      <w:r>
-        <w:rPr>
-          <w:sz w:val="26"/>
-          <w:szCs w:val="26"/>
-        </w:rPr>
-        <w:t xml:space="preserve"> sẽ lưu trữ dữ liệu của các bệnh nhân (không bao gồm những người tới khám) vào patient.txt để có thể tiếp tục quản lí khi mở lại chương trình.</w:t>
-      </w:r>
-    </w:p>
-    <w:p>
-      <w:pPr>
-        <w:pStyle w:val="oancuaDanhsach"/>
-        <w:ind w:left="1440"/>
-        <w:rPr>
-          <w:sz w:val="26"/>
-          <w:szCs w:val="26"/>
-        </w:rPr>
-      </w:pPr>
-    </w:p>
-    <w:p>
-      <w:pPr>
-        <w:ind w:firstLine="720"/>
-      </w:pPr>
-      <w:r>
-        <w:rPr>
-          <w:b/>
-          <w:bCs/>
-          <w:sz w:val="28"/>
-          <w:szCs w:val="28"/>
-        </w:rPr>
-        <w:t xml:space="preserve">  </w:t>
-      </w:r>
-      <w:r>
-        <w:rPr>
-          <w:b/>
-          <w:bCs/>
-          <w:sz w:val="28"/>
-          <w:szCs w:val="28"/>
-        </w:rPr>
-        <w:t xml:space="preserve">## Lưu ý khi sử dụng hệ </w:t>
-      </w:r>
-      <w:r>
-        <w:rPr>
-          <w:b/>
-          <w:bCs/>
-          <w:sz w:val="28"/>
-          <w:szCs w:val="28"/>
-        </w:rPr>
-        <w:t>thống</w:t>
-      </w:r>
-      <w:r>
-        <w:t>:</w:t>
-      </w:r>
-    </w:p>
-    <w:p>
-      <w:pPr>
-        <w:ind w:firstLine="720"/>
-      </w:pPr>
-    </w:p>
-    <w:p>
-      <w:pPr>
-        <w:pStyle w:val="oancuaDanhsach"/>
-        <w:numPr>
-          <w:ilvl w:val="0"/>
-          <w:numId w:val="37"/>
-        </w:numPr>
-      </w:pPr>
-      <w:r>
-        <w:t xml:space="preserve">Chức năng "Gọi bệnh nhân khám tiếp theo" của nhóm chức năng thứ 2 hoạt động theo nguyên tắc FIFO của </w:t>
-      </w:r>
-      <w:proofErr w:type="spellStart"/>
-      <w:r>
-        <w:t>Queue</w:t>
-      </w:r>
-      <w:proofErr w:type="spellEnd"/>
-      <w:r>
-        <w:t>.</w:t>
-      </w:r>
-    </w:p>
-    <w:p>
-      <w:pPr>
-        <w:pStyle w:val="oancuaDanhsach"/>
-        <w:numPr>
-          <w:ilvl w:val="0"/>
-          <w:numId w:val="37"/>
-        </w:numPr>
-      </w:pPr>
-      <w:r>
-        <w:t>Khi bệnh nhân được gọi khám, bệnh nhân đó sẽ tự động bị xóa khỏi hàng đợi khám. - Điều này cũng khá tương tự với chức năng "Xử lí bệnh nhân có mức độ ưu tiên cao nhất" trong nhóm chức năng thứ 3.</w:t>
-      </w:r>
-    </w:p>
-    <w:p>
-      <w:pPr>
-        <w:pStyle w:val="oancuaDanhsach"/>
-        <w:numPr>
-          <w:ilvl w:val="0"/>
-          <w:numId w:val="37"/>
-        </w:numPr>
-      </w:pPr>
-      <w:r>
-        <w:t>Do đó số lượng bệnh nhân đang chờ khám sẽ giảm đi 1 và bệnh nhân đầu hàng đợi sẽ thay đổi.</w:t>
-      </w:r>
-    </w:p>
-    <w:p>
-      <w:pPr>
-        <w:pStyle w:val="oancuaDanhsach"/>
-        <w:numPr>
-          <w:ilvl w:val="0"/>
-          <w:numId w:val="37"/>
-        </w:numPr>
-      </w:pPr>
-      <w:r>
-        <w:t>Đây là hành vi được thiết kế nhằm mô phỏng đúng quy trình hoạt động thực tế của bệnh viện.</w:t>
-      </w:r>
+      </w:pPr>
     </w:p>
     <w:p>
       <w:pPr>
         <w:pStyle w:val="oancuaDanhsach"/>
         <w:ind w:left="1080"/>
-        <w:rPr>
-          <w:b/>
-          <w:bCs/>
-          <w:sz w:val="28"/>
-          <w:szCs w:val="28"/>
-        </w:rPr>
-      </w:pPr>
-    </w:p>
-    <w:p>
-      <w:pPr>
-        <w:pStyle w:val="oancuaDanhsach"/>
-        <w:numPr>
-          <w:ilvl w:val="0"/>
-          <w:numId w:val="16"/>
-        </w:numPr>
-        <w:rPr>
-          <w:b/>
-          <w:bCs/>
-          <w:sz w:val="28"/>
-          <w:szCs w:val="28"/>
-        </w:rPr>
-      </w:pPr>
-      <w:r>
-        <w:rPr>
-          <w:b/>
-          <w:bCs/>
-          <w:sz w:val="28"/>
-          <w:szCs w:val="28"/>
-        </w:rPr>
-        <w:t>Tổng kết</w:t>
+      </w:pPr>
+      <w:r>
+        <w:t>Qua quá trình thực hiện, hoàn thành đồ án này nhóm đã có thể luyện tập, ôn lại và ứng dụng các kiến thức về cấu trúc dữ liệu và giải thuật trong quá trính học tập. Bên cạnh đó nhóm cũng đã biết thêm về việc ứng dụng AI vào việc học tập và hỗ trợ trong làm việc.</w:t>
       </w:r>
     </w:p>
     <w:p>
@@ -1928,94 +2473,10 @@
         <w:ind w:left="1080"/>
       </w:pPr>
       <w:r>
-        <w:t xml:space="preserve">Qua quá trình thực hiện, hoàn thành đồ án này nhóm đã có thể luyện tập, ôn lại và ứng dụng các kiến thức về cấu trúc dữ liệu và giải thuật trong quá </w:t>
-      </w:r>
-      <w:proofErr w:type="spellStart"/>
-      <w:r>
-        <w:t>trính</w:t>
-      </w:r>
-      <w:proofErr w:type="spellEnd"/>
-      <w:r>
-        <w:t xml:space="preserve"> học tập. Bên cạnh đó nhóm cũng đã biết thêm về việc ứng dụng AI vào việc học tập và hỗ trợ trong làm việc.</w:t>
-      </w:r>
-    </w:p>
-    <w:p>
-      <w:pPr>
-        <w:pStyle w:val="oancuaDanhsach"/>
-        <w:ind w:left="1080"/>
-      </w:pPr>
-    </w:p>
-    <w:p>
-      <w:pPr>
-        <w:pStyle w:val="oancuaDanhsach"/>
-        <w:ind w:left="1080"/>
-      </w:pPr>
-      <w:r>
-        <w:t xml:space="preserve">Đồ án đã ứng dụng các cấu trúc dữ liệu quan trọng như AVL </w:t>
-      </w:r>
-      <w:proofErr w:type="spellStart"/>
-      <w:r>
-        <w:t>Tree</w:t>
-      </w:r>
-      <w:proofErr w:type="spellEnd"/>
-      <w:r>
-        <w:t xml:space="preserve">, </w:t>
-      </w:r>
-      <w:proofErr w:type="spellStart"/>
-      <w:r>
-        <w:t>Hash</w:t>
-      </w:r>
-      <w:proofErr w:type="spellEnd"/>
-      <w:r>
-        <w:t xml:space="preserve"> </w:t>
-      </w:r>
-      <w:proofErr w:type="spellStart"/>
-      <w:r>
-        <w:t>Table</w:t>
-      </w:r>
-      <w:proofErr w:type="spellEnd"/>
-      <w:r>
-        <w:t xml:space="preserve">, </w:t>
-      </w:r>
-      <w:proofErr w:type="spellStart"/>
-      <w:r>
-        <w:t>Queue</w:t>
-      </w:r>
-      <w:proofErr w:type="spellEnd"/>
-      <w:r>
-        <w:t xml:space="preserve">, </w:t>
-      </w:r>
-      <w:proofErr w:type="spellStart"/>
-      <w:r>
-        <w:t>Priority</w:t>
-      </w:r>
-      <w:proofErr w:type="spellEnd"/>
-      <w:r>
-        <w:t xml:space="preserve"> </w:t>
-      </w:r>
-      <w:proofErr w:type="spellStart"/>
-      <w:r>
-        <w:t>Queue</w:t>
-      </w:r>
-      <w:proofErr w:type="spellEnd"/>
-      <w:r>
-        <w:t xml:space="preserve"> và thuật toán sắp xếp trong thư viện </w:t>
-      </w:r>
-      <w:proofErr w:type="spellStart"/>
-      <w:r>
-        <w:t>Algorithm</w:t>
-      </w:r>
-      <w:proofErr w:type="spellEnd"/>
-      <w:r>
-        <w:t xml:space="preserve">. Bên cạnh đó nhóm cũng đã học được cách quản lí, sắp xếp các </w:t>
-      </w:r>
-      <w:proofErr w:type="spellStart"/>
-      <w:r>
-        <w:t>file</w:t>
-      </w:r>
-      <w:proofErr w:type="spellEnd"/>
-      <w:r>
-        <w:t xml:space="preserve"> sao cho hợp </w:t>
+        <w:t xml:space="preserve">Đồ án đã ứng dụng các cấu trúc dữ liệu quan trọng như AVL Tree, Hash Table, Queue, Priority Queue và thuật toán sắp xếp trong thư viện </w:t>
+      </w:r>
+      <w:r>
+        <w:t xml:space="preserve">Algorithm. Bên cạnh đó nhóm cũng đã học được cách quản lí, sắp xếp các file sao cho hợp </w:t>
       </w:r>
       <w:r>
         <w:t>lí.</w:t>
@@ -2564,6 +3025,155 @@
     </w:lvl>
   </w:abstractNum>
   <w:abstractNum w:abstractNumId="4" w15:restartNumberingAfterBreak="0">
+    <w:nsid w:val="043C2683"/>
+    <w:multiLevelType w:val="multilevel"/>
+    <w:tmpl w:val="6438353E"/>
+    <w:lvl w:ilvl="0">
+      <w:start w:val="1"/>
+      <w:numFmt w:val="bullet"/>
+      <w:lvlText w:val=""/>
+      <w:lvlJc w:val="left"/>
+      <w:pPr>
+        <w:tabs>
+          <w:tab w:val="num" w:pos="720"/>
+        </w:tabs>
+        <w:ind w:left="720" w:hanging="360"/>
+      </w:pPr>
+      <w:rPr>
+        <w:rFonts w:ascii="Symbol" w:hAnsi="Symbol" w:hint="default"/>
+        <w:sz w:val="20"/>
+      </w:rPr>
+    </w:lvl>
+    <w:lvl w:ilvl="1" w:tentative="1">
+      <w:start w:val="1"/>
+      <w:numFmt w:val="bullet"/>
+      <w:lvlText w:val="o"/>
+      <w:lvlJc w:val="left"/>
+      <w:pPr>
+        <w:tabs>
+          <w:tab w:val="num" w:pos="1440"/>
+        </w:tabs>
+        <w:ind w:left="1440" w:hanging="360"/>
+      </w:pPr>
+      <w:rPr>
+        <w:rFonts w:ascii="Courier New" w:hAnsi="Courier New" w:hint="default"/>
+        <w:sz w:val="20"/>
+      </w:rPr>
+    </w:lvl>
+    <w:lvl w:ilvl="2" w:tentative="1">
+      <w:start w:val="1"/>
+      <w:numFmt w:val="bullet"/>
+      <w:lvlText w:val=""/>
+      <w:lvlJc w:val="left"/>
+      <w:pPr>
+        <w:tabs>
+          <w:tab w:val="num" w:pos="2160"/>
+        </w:tabs>
+        <w:ind w:left="2160" w:hanging="360"/>
+      </w:pPr>
+      <w:rPr>
+        <w:rFonts w:ascii="Wingdings" w:hAnsi="Wingdings" w:hint="default"/>
+        <w:sz w:val="20"/>
+      </w:rPr>
+    </w:lvl>
+    <w:lvl w:ilvl="3" w:tentative="1">
+      <w:start w:val="1"/>
+      <w:numFmt w:val="bullet"/>
+      <w:lvlText w:val=""/>
+      <w:lvlJc w:val="left"/>
+      <w:pPr>
+        <w:tabs>
+          <w:tab w:val="num" w:pos="2880"/>
+        </w:tabs>
+        <w:ind w:left="2880" w:hanging="360"/>
+      </w:pPr>
+      <w:rPr>
+        <w:rFonts w:ascii="Wingdings" w:hAnsi="Wingdings" w:hint="default"/>
+        <w:sz w:val="20"/>
+      </w:rPr>
+    </w:lvl>
+    <w:lvl w:ilvl="4" w:tentative="1">
+      <w:start w:val="1"/>
+      <w:numFmt w:val="bullet"/>
+      <w:lvlText w:val=""/>
+      <w:lvlJc w:val="left"/>
+      <w:pPr>
+        <w:tabs>
+          <w:tab w:val="num" w:pos="3600"/>
+        </w:tabs>
+        <w:ind w:left="3600" w:hanging="360"/>
+      </w:pPr>
+      <w:rPr>
+        <w:rFonts w:ascii="Wingdings" w:hAnsi="Wingdings" w:hint="default"/>
+        <w:sz w:val="20"/>
+      </w:rPr>
+    </w:lvl>
+    <w:lvl w:ilvl="5" w:tentative="1">
+      <w:start w:val="1"/>
+      <w:numFmt w:val="bullet"/>
+      <w:lvlText w:val=""/>
+      <w:lvlJc w:val="left"/>
+      <w:pPr>
+        <w:tabs>
+          <w:tab w:val="num" w:pos="4320"/>
+        </w:tabs>
+        <w:ind w:left="4320" w:hanging="360"/>
+      </w:pPr>
+      <w:rPr>
+        <w:rFonts w:ascii="Wingdings" w:hAnsi="Wingdings" w:hint="default"/>
+        <w:sz w:val="20"/>
+      </w:rPr>
+    </w:lvl>
+    <w:lvl w:ilvl="6" w:tentative="1">
+      <w:start w:val="1"/>
+      <w:numFmt w:val="bullet"/>
+      <w:lvlText w:val=""/>
+      <w:lvlJc w:val="left"/>
+      <w:pPr>
+        <w:tabs>
+          <w:tab w:val="num" w:pos="5040"/>
+        </w:tabs>
+        <w:ind w:left="5040" w:hanging="360"/>
+      </w:pPr>
+      <w:rPr>
+        <w:rFonts w:ascii="Wingdings" w:hAnsi="Wingdings" w:hint="default"/>
+        <w:sz w:val="20"/>
+      </w:rPr>
+    </w:lvl>
+    <w:lvl w:ilvl="7" w:tentative="1">
+      <w:start w:val="1"/>
+      <w:numFmt w:val="bullet"/>
+      <w:lvlText w:val=""/>
+      <w:lvlJc w:val="left"/>
+      <w:pPr>
+        <w:tabs>
+          <w:tab w:val="num" w:pos="5760"/>
+        </w:tabs>
+        <w:ind w:left="5760" w:hanging="360"/>
+      </w:pPr>
+      <w:rPr>
+        <w:rFonts w:ascii="Wingdings" w:hAnsi="Wingdings" w:hint="default"/>
+        <w:sz w:val="20"/>
+      </w:rPr>
+    </w:lvl>
+    <w:lvl w:ilvl="8" w:tentative="1">
+      <w:start w:val="1"/>
+      <w:numFmt w:val="bullet"/>
+      <w:lvlText w:val=""/>
+      <w:lvlJc w:val="left"/>
+      <w:pPr>
+        <w:tabs>
+          <w:tab w:val="num" w:pos="6480"/>
+        </w:tabs>
+        <w:ind w:left="6480" w:hanging="360"/>
+      </w:pPr>
+      <w:rPr>
+        <w:rFonts w:ascii="Wingdings" w:hAnsi="Wingdings" w:hint="default"/>
+        <w:sz w:val="20"/>
+      </w:rPr>
+    </w:lvl>
+  </w:abstractNum>
+  <w:abstractNum w:abstractNumId="5" w15:restartNumberingAfterBreak="0">
     <w:nsid w:val="17C51F94"/>
     <w:multiLevelType w:val="hybridMultilevel"/>
     <w:tmpl w:val="D6DC48CE"/>
@@ -2652,7 +3262,7 @@
       </w:pPr>
     </w:lvl>
   </w:abstractNum>
-  <w:abstractNum w:abstractNumId="5" w15:restartNumberingAfterBreak="0">
+  <w:abstractNum w:abstractNumId="6" w15:restartNumberingAfterBreak="0">
     <w:nsid w:val="18053E0C"/>
     <w:multiLevelType w:val="hybridMultilevel"/>
     <w:tmpl w:val="41581880"/>
@@ -2765,7 +3375,7 @@
       </w:rPr>
     </w:lvl>
   </w:abstractNum>
-  <w:abstractNum w:abstractNumId="6" w15:restartNumberingAfterBreak="0">
+  <w:abstractNum w:abstractNumId="7" w15:restartNumberingAfterBreak="0">
     <w:nsid w:val="19E5094E"/>
     <w:multiLevelType w:val="multilevel"/>
     <w:tmpl w:val="5F0EF91C"/>
@@ -2914,7 +3524,7 @@
       </w:rPr>
     </w:lvl>
   </w:abstractNum>
-  <w:abstractNum w:abstractNumId="7" w15:restartNumberingAfterBreak="0">
+  <w:abstractNum w:abstractNumId="8" w15:restartNumberingAfterBreak="0">
     <w:nsid w:val="1A957168"/>
     <w:multiLevelType w:val="hybridMultilevel"/>
     <w:tmpl w:val="F0FCAB38"/>
@@ -3027,7 +3637,7 @@
       </w:rPr>
     </w:lvl>
   </w:abstractNum>
-  <w:abstractNum w:abstractNumId="8" w15:restartNumberingAfterBreak="0">
+  <w:abstractNum w:abstractNumId="9" w15:restartNumberingAfterBreak="0">
     <w:nsid w:val="1BA06E52"/>
     <w:multiLevelType w:val="hybridMultilevel"/>
     <w:tmpl w:val="FF4C969C"/>
@@ -3140,7 +3750,7 @@
       </w:rPr>
     </w:lvl>
   </w:abstractNum>
-  <w:abstractNum w:abstractNumId="9" w15:restartNumberingAfterBreak="0">
+  <w:abstractNum w:abstractNumId="10" w15:restartNumberingAfterBreak="0">
     <w:nsid w:val="21AE4317"/>
     <w:multiLevelType w:val="multilevel"/>
     <w:tmpl w:val="FFA27AB8"/>
@@ -3289,7 +3899,7 @@
       </w:rPr>
     </w:lvl>
   </w:abstractNum>
-  <w:abstractNum w:abstractNumId="10" w15:restartNumberingAfterBreak="0">
+  <w:abstractNum w:abstractNumId="11" w15:restartNumberingAfterBreak="0">
     <w:nsid w:val="22E30774"/>
     <w:multiLevelType w:val="hybridMultilevel"/>
     <w:tmpl w:val="7D92DFEC"/>
@@ -3402,7 +4012,7 @@
       </w:rPr>
     </w:lvl>
   </w:abstractNum>
-  <w:abstractNum w:abstractNumId="11" w15:restartNumberingAfterBreak="0">
+  <w:abstractNum w:abstractNumId="12" w15:restartNumberingAfterBreak="0">
     <w:nsid w:val="23C201C5"/>
     <w:multiLevelType w:val="hybridMultilevel"/>
     <w:tmpl w:val="2986614E"/>
@@ -3515,7 +4125,7 @@
       </w:rPr>
     </w:lvl>
   </w:abstractNum>
-  <w:abstractNum w:abstractNumId="12" w15:restartNumberingAfterBreak="0">
+  <w:abstractNum w:abstractNumId="13" w15:restartNumberingAfterBreak="0">
     <w:nsid w:val="24297463"/>
     <w:multiLevelType w:val="multilevel"/>
     <w:tmpl w:val="78F4BA84"/>
@@ -3664,7 +4274,7 @@
       </w:rPr>
     </w:lvl>
   </w:abstractNum>
-  <w:abstractNum w:abstractNumId="13" w15:restartNumberingAfterBreak="0">
+  <w:abstractNum w:abstractNumId="14" w15:restartNumberingAfterBreak="0">
     <w:nsid w:val="26791DD8"/>
     <w:multiLevelType w:val="hybridMultilevel"/>
     <w:tmpl w:val="3FB67F54"/>
@@ -3777,7 +4387,7 @@
       </w:rPr>
     </w:lvl>
   </w:abstractNum>
-  <w:abstractNum w:abstractNumId="14" w15:restartNumberingAfterBreak="0">
+  <w:abstractNum w:abstractNumId="15" w15:restartNumberingAfterBreak="0">
     <w:nsid w:val="293C1B56"/>
     <w:multiLevelType w:val="hybridMultilevel"/>
     <w:tmpl w:val="B4A8339C"/>
@@ -3866,7 +4476,7 @@
       </w:pPr>
     </w:lvl>
   </w:abstractNum>
-  <w:abstractNum w:abstractNumId="15" w15:restartNumberingAfterBreak="0">
+  <w:abstractNum w:abstractNumId="16" w15:restartNumberingAfterBreak="0">
     <w:nsid w:val="2CE92553"/>
     <w:multiLevelType w:val="hybridMultilevel"/>
     <w:tmpl w:val="54BC23A8"/>
@@ -3955,7 +4565,7 @@
       </w:pPr>
     </w:lvl>
   </w:abstractNum>
-  <w:abstractNum w:abstractNumId="16" w15:restartNumberingAfterBreak="0">
+  <w:abstractNum w:abstractNumId="17" w15:restartNumberingAfterBreak="0">
     <w:nsid w:val="32412FF6"/>
     <w:multiLevelType w:val="multilevel"/>
     <w:tmpl w:val="4F3E7316"/>
@@ -4104,7 +4714,7 @@
       </w:rPr>
     </w:lvl>
   </w:abstractNum>
-  <w:abstractNum w:abstractNumId="17" w15:restartNumberingAfterBreak="0">
+  <w:abstractNum w:abstractNumId="18" w15:restartNumberingAfterBreak="0">
     <w:nsid w:val="35361703"/>
     <w:multiLevelType w:val="multilevel"/>
     <w:tmpl w:val="F80EFD58"/>
@@ -4253,7 +4863,7 @@
       </w:rPr>
     </w:lvl>
   </w:abstractNum>
-  <w:abstractNum w:abstractNumId="18" w15:restartNumberingAfterBreak="0">
+  <w:abstractNum w:abstractNumId="19" w15:restartNumberingAfterBreak="0">
     <w:nsid w:val="3537411A"/>
     <w:multiLevelType w:val="multilevel"/>
     <w:tmpl w:val="88D83C58"/>
@@ -4402,7 +5012,7 @@
       </w:rPr>
     </w:lvl>
   </w:abstractNum>
-  <w:abstractNum w:abstractNumId="19" w15:restartNumberingAfterBreak="0">
+  <w:abstractNum w:abstractNumId="20" w15:restartNumberingAfterBreak="0">
     <w:nsid w:val="380C5E73"/>
     <w:multiLevelType w:val="hybridMultilevel"/>
     <w:tmpl w:val="EABA660E"/>
@@ -4515,7 +5125,7 @@
       </w:rPr>
     </w:lvl>
   </w:abstractNum>
-  <w:abstractNum w:abstractNumId="20" w15:restartNumberingAfterBreak="0">
+  <w:abstractNum w:abstractNumId="21" w15:restartNumberingAfterBreak="0">
     <w:nsid w:val="399539D5"/>
     <w:multiLevelType w:val="hybridMultilevel"/>
     <w:tmpl w:val="C8BE9D30"/>
@@ -4604,7 +5214,7 @@
       </w:pPr>
     </w:lvl>
   </w:abstractNum>
-  <w:abstractNum w:abstractNumId="21" w15:restartNumberingAfterBreak="0">
+  <w:abstractNum w:abstractNumId="22" w15:restartNumberingAfterBreak="0">
     <w:nsid w:val="3B421CF8"/>
     <w:multiLevelType w:val="hybridMultilevel"/>
     <w:tmpl w:val="04C67980"/>
@@ -4693,7 +5303,7 @@
       </w:pPr>
     </w:lvl>
   </w:abstractNum>
-  <w:abstractNum w:abstractNumId="22" w15:restartNumberingAfterBreak="0">
+  <w:abstractNum w:abstractNumId="23" w15:restartNumberingAfterBreak="0">
     <w:nsid w:val="3E9A6613"/>
     <w:multiLevelType w:val="hybridMultilevel"/>
     <w:tmpl w:val="5B925E92"/>
@@ -4806,7 +5416,233 @@
       </w:rPr>
     </w:lvl>
   </w:abstractNum>
-  <w:abstractNum w:abstractNumId="23" w15:restartNumberingAfterBreak="0">
+  <w:abstractNum w:abstractNumId="24" w15:restartNumberingAfterBreak="0">
+    <w:nsid w:val="444E31AD"/>
+    <w:multiLevelType w:val="hybridMultilevel"/>
+    <w:tmpl w:val="FCE47F0E"/>
+    <w:lvl w:ilvl="0" w:tplc="042A0001">
+      <w:start w:val="1"/>
+      <w:numFmt w:val="bullet"/>
+      <w:lvlText w:val=""/>
+      <w:lvlJc w:val="left"/>
+      <w:pPr>
+        <w:ind w:left="2520" w:hanging="360"/>
+      </w:pPr>
+      <w:rPr>
+        <w:rFonts w:ascii="Symbol" w:hAnsi="Symbol" w:hint="default"/>
+      </w:rPr>
+    </w:lvl>
+    <w:lvl w:ilvl="1" w:tplc="042A0003" w:tentative="1">
+      <w:start w:val="1"/>
+      <w:numFmt w:val="bullet"/>
+      <w:lvlText w:val="o"/>
+      <w:lvlJc w:val="left"/>
+      <w:pPr>
+        <w:ind w:left="3240" w:hanging="360"/>
+      </w:pPr>
+      <w:rPr>
+        <w:rFonts w:ascii="Courier New" w:hAnsi="Courier New" w:cs="Courier New" w:hint="default"/>
+      </w:rPr>
+    </w:lvl>
+    <w:lvl w:ilvl="2" w:tplc="042A0005" w:tentative="1">
+      <w:start w:val="1"/>
+      <w:numFmt w:val="bullet"/>
+      <w:lvlText w:val=""/>
+      <w:lvlJc w:val="left"/>
+      <w:pPr>
+        <w:ind w:left="3960" w:hanging="360"/>
+      </w:pPr>
+      <w:rPr>
+        <w:rFonts w:ascii="Wingdings" w:hAnsi="Wingdings" w:hint="default"/>
+      </w:rPr>
+    </w:lvl>
+    <w:lvl w:ilvl="3" w:tplc="042A0001" w:tentative="1">
+      <w:start w:val="1"/>
+      <w:numFmt w:val="bullet"/>
+      <w:lvlText w:val=""/>
+      <w:lvlJc w:val="left"/>
+      <w:pPr>
+        <w:ind w:left="4680" w:hanging="360"/>
+      </w:pPr>
+      <w:rPr>
+        <w:rFonts w:ascii="Symbol" w:hAnsi="Symbol" w:hint="default"/>
+      </w:rPr>
+    </w:lvl>
+    <w:lvl w:ilvl="4" w:tplc="042A0003" w:tentative="1">
+      <w:start w:val="1"/>
+      <w:numFmt w:val="bullet"/>
+      <w:lvlText w:val="o"/>
+      <w:lvlJc w:val="left"/>
+      <w:pPr>
+        <w:ind w:left="5400" w:hanging="360"/>
+      </w:pPr>
+      <w:rPr>
+        <w:rFonts w:ascii="Courier New" w:hAnsi="Courier New" w:cs="Courier New" w:hint="default"/>
+      </w:rPr>
+    </w:lvl>
+    <w:lvl w:ilvl="5" w:tplc="042A0005" w:tentative="1">
+      <w:start w:val="1"/>
+      <w:numFmt w:val="bullet"/>
+      <w:lvlText w:val=""/>
+      <w:lvlJc w:val="left"/>
+      <w:pPr>
+        <w:ind w:left="6120" w:hanging="360"/>
+      </w:pPr>
+      <w:rPr>
+        <w:rFonts w:ascii="Wingdings" w:hAnsi="Wingdings" w:hint="default"/>
+      </w:rPr>
+    </w:lvl>
+    <w:lvl w:ilvl="6" w:tplc="042A0001" w:tentative="1">
+      <w:start w:val="1"/>
+      <w:numFmt w:val="bullet"/>
+      <w:lvlText w:val=""/>
+      <w:lvlJc w:val="left"/>
+      <w:pPr>
+        <w:ind w:left="6840" w:hanging="360"/>
+      </w:pPr>
+      <w:rPr>
+        <w:rFonts w:ascii="Symbol" w:hAnsi="Symbol" w:hint="default"/>
+      </w:rPr>
+    </w:lvl>
+    <w:lvl w:ilvl="7" w:tplc="042A0003" w:tentative="1">
+      <w:start w:val="1"/>
+      <w:numFmt w:val="bullet"/>
+      <w:lvlText w:val="o"/>
+      <w:lvlJc w:val="left"/>
+      <w:pPr>
+        <w:ind w:left="7560" w:hanging="360"/>
+      </w:pPr>
+      <w:rPr>
+        <w:rFonts w:ascii="Courier New" w:hAnsi="Courier New" w:cs="Courier New" w:hint="default"/>
+      </w:rPr>
+    </w:lvl>
+    <w:lvl w:ilvl="8" w:tplc="042A0005" w:tentative="1">
+      <w:start w:val="1"/>
+      <w:numFmt w:val="bullet"/>
+      <w:lvlText w:val=""/>
+      <w:lvlJc w:val="left"/>
+      <w:pPr>
+        <w:ind w:left="8280" w:hanging="360"/>
+      </w:pPr>
+      <w:rPr>
+        <w:rFonts w:ascii="Wingdings" w:hAnsi="Wingdings" w:hint="default"/>
+      </w:rPr>
+    </w:lvl>
+  </w:abstractNum>
+  <w:abstractNum w:abstractNumId="25" w15:restartNumberingAfterBreak="0">
+    <w:nsid w:val="49EB0797"/>
+    <w:multiLevelType w:val="hybridMultilevel"/>
+    <w:tmpl w:val="D4DA4674"/>
+    <w:lvl w:ilvl="0" w:tplc="042A0001">
+      <w:start w:val="1"/>
+      <w:numFmt w:val="bullet"/>
+      <w:lvlText w:val=""/>
+      <w:lvlJc w:val="left"/>
+      <w:pPr>
+        <w:ind w:left="2520" w:hanging="360"/>
+      </w:pPr>
+      <w:rPr>
+        <w:rFonts w:ascii="Symbol" w:hAnsi="Symbol" w:hint="default"/>
+      </w:rPr>
+    </w:lvl>
+    <w:lvl w:ilvl="1" w:tplc="042A0003" w:tentative="1">
+      <w:start w:val="1"/>
+      <w:numFmt w:val="bullet"/>
+      <w:lvlText w:val="o"/>
+      <w:lvlJc w:val="left"/>
+      <w:pPr>
+        <w:ind w:left="3240" w:hanging="360"/>
+      </w:pPr>
+      <w:rPr>
+        <w:rFonts w:ascii="Courier New" w:hAnsi="Courier New" w:cs="Courier New" w:hint="default"/>
+      </w:rPr>
+    </w:lvl>
+    <w:lvl w:ilvl="2" w:tplc="042A0005" w:tentative="1">
+      <w:start w:val="1"/>
+      <w:numFmt w:val="bullet"/>
+      <w:lvlText w:val=""/>
+      <w:lvlJc w:val="left"/>
+      <w:pPr>
+        <w:ind w:left="3960" w:hanging="360"/>
+      </w:pPr>
+      <w:rPr>
+        <w:rFonts w:ascii="Wingdings" w:hAnsi="Wingdings" w:hint="default"/>
+      </w:rPr>
+    </w:lvl>
+    <w:lvl w:ilvl="3" w:tplc="042A0001" w:tentative="1">
+      <w:start w:val="1"/>
+      <w:numFmt w:val="bullet"/>
+      <w:lvlText w:val=""/>
+      <w:lvlJc w:val="left"/>
+      <w:pPr>
+        <w:ind w:left="4680" w:hanging="360"/>
+      </w:pPr>
+      <w:rPr>
+        <w:rFonts w:ascii="Symbol" w:hAnsi="Symbol" w:hint="default"/>
+      </w:rPr>
+    </w:lvl>
+    <w:lvl w:ilvl="4" w:tplc="042A0003" w:tentative="1">
+      <w:start w:val="1"/>
+      <w:numFmt w:val="bullet"/>
+      <w:lvlText w:val="o"/>
+      <w:lvlJc w:val="left"/>
+      <w:pPr>
+        <w:ind w:left="5400" w:hanging="360"/>
+      </w:pPr>
+      <w:rPr>
+        <w:rFonts w:ascii="Courier New" w:hAnsi="Courier New" w:cs="Courier New" w:hint="default"/>
+      </w:rPr>
+    </w:lvl>
+    <w:lvl w:ilvl="5" w:tplc="042A0005" w:tentative="1">
+      <w:start w:val="1"/>
+      <w:numFmt w:val="bullet"/>
+      <w:lvlText w:val=""/>
+      <w:lvlJc w:val="left"/>
+      <w:pPr>
+        <w:ind w:left="6120" w:hanging="360"/>
+      </w:pPr>
+      <w:rPr>
+        <w:rFonts w:ascii="Wingdings" w:hAnsi="Wingdings" w:hint="default"/>
+      </w:rPr>
+    </w:lvl>
+    <w:lvl w:ilvl="6" w:tplc="042A0001" w:tentative="1">
+      <w:start w:val="1"/>
+      <w:numFmt w:val="bullet"/>
+      <w:lvlText w:val=""/>
+      <w:lvlJc w:val="left"/>
+      <w:pPr>
+        <w:ind w:left="6840" w:hanging="360"/>
+      </w:pPr>
+      <w:rPr>
+        <w:rFonts w:ascii="Symbol" w:hAnsi="Symbol" w:hint="default"/>
+      </w:rPr>
+    </w:lvl>
+    <w:lvl w:ilvl="7" w:tplc="042A0003" w:tentative="1">
+      <w:start w:val="1"/>
+      <w:numFmt w:val="bullet"/>
+      <w:lvlText w:val="o"/>
+      <w:lvlJc w:val="left"/>
+      <w:pPr>
+        <w:ind w:left="7560" w:hanging="360"/>
+      </w:pPr>
+      <w:rPr>
+        <w:rFonts w:ascii="Courier New" w:hAnsi="Courier New" w:cs="Courier New" w:hint="default"/>
+      </w:rPr>
+    </w:lvl>
+    <w:lvl w:ilvl="8" w:tplc="042A0005" w:tentative="1">
+      <w:start w:val="1"/>
+      <w:numFmt w:val="bullet"/>
+      <w:lvlText w:val=""/>
+      <w:lvlJc w:val="left"/>
+      <w:pPr>
+        <w:ind w:left="8280" w:hanging="360"/>
+      </w:pPr>
+      <w:rPr>
+        <w:rFonts w:ascii="Wingdings" w:hAnsi="Wingdings" w:hint="default"/>
+      </w:rPr>
+    </w:lvl>
+  </w:abstractNum>
+  <w:abstractNum w:abstractNumId="26" w15:restartNumberingAfterBreak="0">
     <w:nsid w:val="51E515C2"/>
     <w:multiLevelType w:val="hybridMultilevel"/>
     <w:tmpl w:val="AFD8834C"/>
@@ -4919,7 +5755,96 @@
       </w:rPr>
     </w:lvl>
   </w:abstractNum>
-  <w:abstractNum w:abstractNumId="24" w15:restartNumberingAfterBreak="0">
+  <w:abstractNum w:abstractNumId="27" w15:restartNumberingAfterBreak="0">
+    <w:nsid w:val="57D376CB"/>
+    <w:multiLevelType w:val="hybridMultilevel"/>
+    <w:tmpl w:val="53F6935E"/>
+    <w:lvl w:ilvl="0" w:tplc="5BE84EE0">
+      <w:start w:val="1"/>
+      <w:numFmt w:val="decimal"/>
+      <w:lvlText w:val="%1."/>
+      <w:lvlJc w:val="left"/>
+      <w:pPr>
+        <w:ind w:left="1440" w:hanging="360"/>
+      </w:pPr>
+      <w:rPr>
+        <w:rFonts w:hint="default"/>
+      </w:rPr>
+    </w:lvl>
+    <w:lvl w:ilvl="1" w:tplc="042A0019" w:tentative="1">
+      <w:start w:val="1"/>
+      <w:numFmt w:val="lowerLetter"/>
+      <w:lvlText w:val="%2."/>
+      <w:lvlJc w:val="left"/>
+      <w:pPr>
+        <w:ind w:left="2160" w:hanging="360"/>
+      </w:pPr>
+    </w:lvl>
+    <w:lvl w:ilvl="2" w:tplc="042A001B" w:tentative="1">
+      <w:start w:val="1"/>
+      <w:numFmt w:val="lowerRoman"/>
+      <w:lvlText w:val="%3."/>
+      <w:lvlJc w:val="right"/>
+      <w:pPr>
+        <w:ind w:left="2880" w:hanging="180"/>
+      </w:pPr>
+    </w:lvl>
+    <w:lvl w:ilvl="3" w:tplc="042A000F" w:tentative="1">
+      <w:start w:val="1"/>
+      <w:numFmt w:val="decimal"/>
+      <w:lvlText w:val="%4."/>
+      <w:lvlJc w:val="left"/>
+      <w:pPr>
+        <w:ind w:left="3600" w:hanging="360"/>
+      </w:pPr>
+    </w:lvl>
+    <w:lvl w:ilvl="4" w:tplc="042A0019" w:tentative="1">
+      <w:start w:val="1"/>
+      <w:numFmt w:val="lowerLetter"/>
+      <w:lvlText w:val="%5."/>
+      <w:lvlJc w:val="left"/>
+      <w:pPr>
+        <w:ind w:left="4320" w:hanging="360"/>
+      </w:pPr>
+    </w:lvl>
+    <w:lvl w:ilvl="5" w:tplc="042A001B" w:tentative="1">
+      <w:start w:val="1"/>
+      <w:numFmt w:val="lowerRoman"/>
+      <w:lvlText w:val="%6."/>
+      <w:lvlJc w:val="right"/>
+      <w:pPr>
+        <w:ind w:left="5040" w:hanging="180"/>
+      </w:pPr>
+    </w:lvl>
+    <w:lvl w:ilvl="6" w:tplc="042A000F" w:tentative="1">
+      <w:start w:val="1"/>
+      <w:numFmt w:val="decimal"/>
+      <w:lvlText w:val="%7."/>
+      <w:lvlJc w:val="left"/>
+      <w:pPr>
+        <w:ind w:left="5760" w:hanging="360"/>
+      </w:pPr>
+    </w:lvl>
+    <w:lvl w:ilvl="7" w:tplc="042A0019" w:tentative="1">
+      <w:start w:val="1"/>
+      <w:numFmt w:val="lowerLetter"/>
+      <w:lvlText w:val="%8."/>
+      <w:lvlJc w:val="left"/>
+      <w:pPr>
+        <w:ind w:left="6480" w:hanging="360"/>
+      </w:pPr>
+    </w:lvl>
+    <w:lvl w:ilvl="8" w:tplc="042A001B" w:tentative="1">
+      <w:start w:val="1"/>
+      <w:numFmt w:val="lowerRoman"/>
+      <w:lvlText w:val="%9."/>
+      <w:lvlJc w:val="right"/>
+      <w:pPr>
+        <w:ind w:left="7200" w:hanging="180"/>
+      </w:pPr>
+    </w:lvl>
+  </w:abstractNum>
+  <w:abstractNum w:abstractNumId="28" w15:restartNumberingAfterBreak="0">
     <w:nsid w:val="58D81763"/>
     <w:multiLevelType w:val="hybridMultilevel"/>
     <w:tmpl w:val="E7509398"/>
@@ -5032,7 +5957,7 @@
       </w:rPr>
     </w:lvl>
   </w:abstractNum>
-  <w:abstractNum w:abstractNumId="25" w15:restartNumberingAfterBreak="0">
+  <w:abstractNum w:abstractNumId="29" w15:restartNumberingAfterBreak="0">
     <w:nsid w:val="59821BD6"/>
     <w:multiLevelType w:val="multilevel"/>
     <w:tmpl w:val="2000F166"/>
@@ -5181,7 +6106,7 @@
       </w:rPr>
     </w:lvl>
   </w:abstractNum>
-  <w:abstractNum w:abstractNumId="26" w15:restartNumberingAfterBreak="0">
+  <w:abstractNum w:abstractNumId="30" w15:restartNumberingAfterBreak="0">
     <w:nsid w:val="5C8648BF"/>
     <w:multiLevelType w:val="multilevel"/>
     <w:tmpl w:val="1568A124"/>
@@ -5330,7 +6255,7 @@
       </w:rPr>
     </w:lvl>
   </w:abstractNum>
-  <w:abstractNum w:abstractNumId="27" w15:restartNumberingAfterBreak="0">
+  <w:abstractNum w:abstractNumId="31" w15:restartNumberingAfterBreak="0">
     <w:nsid w:val="5CC719D9"/>
     <w:multiLevelType w:val="multilevel"/>
     <w:tmpl w:val="9AB219EC"/>
@@ -5443,7 +6368,7 @@
       </w:pPr>
     </w:lvl>
   </w:abstractNum>
-  <w:abstractNum w:abstractNumId="28" w15:restartNumberingAfterBreak="0">
+  <w:abstractNum w:abstractNumId="32" w15:restartNumberingAfterBreak="0">
     <w:nsid w:val="5F7A1B76"/>
     <w:multiLevelType w:val="hybridMultilevel"/>
     <w:tmpl w:val="57524292"/>
@@ -5556,7 +6481,7 @@
       </w:rPr>
     </w:lvl>
   </w:abstractNum>
-  <w:abstractNum w:abstractNumId="29" w15:restartNumberingAfterBreak="0">
+  <w:abstractNum w:abstractNumId="33" w15:restartNumberingAfterBreak="0">
     <w:nsid w:val="627E4737"/>
     <w:multiLevelType w:val="hybridMultilevel"/>
     <w:tmpl w:val="86B40982"/>
@@ -5669,7 +6594,7 @@
       </w:rPr>
     </w:lvl>
   </w:abstractNum>
-  <w:abstractNum w:abstractNumId="30" w15:restartNumberingAfterBreak="0">
+  <w:abstractNum w:abstractNumId="34" w15:restartNumberingAfterBreak="0">
     <w:nsid w:val="631614E9"/>
     <w:multiLevelType w:val="hybridMultilevel"/>
     <w:tmpl w:val="DF1CD13E"/>
@@ -5782,7 +6707,7 @@
       </w:rPr>
     </w:lvl>
   </w:abstractNum>
-  <w:abstractNum w:abstractNumId="31" w15:restartNumberingAfterBreak="0">
+  <w:abstractNum w:abstractNumId="35" w15:restartNumberingAfterBreak="0">
     <w:nsid w:val="673C33E0"/>
     <w:multiLevelType w:val="hybridMultilevel"/>
     <w:tmpl w:val="BEC046C0"/>
@@ -5895,7 +6820,120 @@
       </w:rPr>
     </w:lvl>
   </w:abstractNum>
-  <w:abstractNum w:abstractNumId="32" w15:restartNumberingAfterBreak="0">
+  <w:abstractNum w:abstractNumId="36" w15:restartNumberingAfterBreak="0">
+    <w:nsid w:val="69F76B00"/>
+    <w:multiLevelType w:val="hybridMultilevel"/>
+    <w:tmpl w:val="87C2B378"/>
+    <w:lvl w:ilvl="0" w:tplc="89ECB45A">
+      <w:start w:val="2"/>
+      <w:numFmt w:val="bullet"/>
+      <w:lvlText w:val="-"/>
+      <w:lvlJc w:val="left"/>
+      <w:pPr>
+        <w:ind w:left="1800" w:hanging="360"/>
+      </w:pPr>
+      <w:rPr>
+        <w:rFonts w:ascii="Arial" w:eastAsiaTheme="minorHAnsi" w:hAnsi="Arial" w:cs="Arial" w:hint="default"/>
+      </w:rPr>
+    </w:lvl>
+    <w:lvl w:ilvl="1" w:tplc="042A0003" w:tentative="1">
+      <w:start w:val="1"/>
+      <w:numFmt w:val="bullet"/>
+      <w:lvlText w:val="o"/>
+      <w:lvlJc w:val="left"/>
+      <w:pPr>
+        <w:ind w:left="2520" w:hanging="360"/>
+      </w:pPr>
+      <w:rPr>
+        <w:rFonts w:ascii="Courier New" w:hAnsi="Courier New" w:cs="Courier New" w:hint="default"/>
+      </w:rPr>
+    </w:lvl>
+    <w:lvl w:ilvl="2" w:tplc="042A0005" w:tentative="1">
+      <w:start w:val="1"/>
+      <w:numFmt w:val="bullet"/>
+      <w:lvlText w:val=""/>
+      <w:lvlJc w:val="left"/>
+      <w:pPr>
+        <w:ind w:left="3240" w:hanging="360"/>
+      </w:pPr>
+      <w:rPr>
+        <w:rFonts w:ascii="Wingdings" w:hAnsi="Wingdings" w:hint="default"/>
+      </w:rPr>
+    </w:lvl>
+    <w:lvl w:ilvl="3" w:tplc="042A0001" w:tentative="1">
+      <w:start w:val="1"/>
+      <w:numFmt w:val="bullet"/>
+      <w:lvlText w:val=""/>
+      <w:lvlJc w:val="left"/>
+      <w:pPr>
+        <w:ind w:left="3960" w:hanging="360"/>
+      </w:pPr>
+      <w:rPr>
+        <w:rFonts w:ascii="Symbol" w:hAnsi="Symbol" w:hint="default"/>
+      </w:rPr>
+    </w:lvl>
+    <w:lvl w:ilvl="4" w:tplc="042A0003" w:tentative="1">
+      <w:start w:val="1"/>
+      <w:numFmt w:val="bullet"/>
+      <w:lvlText w:val="o"/>
+      <w:lvlJc w:val="left"/>
+      <w:pPr>
+        <w:ind w:left="4680" w:hanging="360"/>
+      </w:pPr>
+      <w:rPr>
+        <w:rFonts w:ascii="Courier New" w:hAnsi="Courier New" w:cs="Courier New" w:hint="default"/>
+      </w:rPr>
+    </w:lvl>
+    <w:lvl w:ilvl="5" w:tplc="042A0005" w:tentative="1">
+      <w:start w:val="1"/>
+      <w:numFmt w:val="bullet"/>
+      <w:lvlText w:val=""/>
+      <w:lvlJc w:val="left"/>
+      <w:pPr>
+        <w:ind w:left="5400" w:hanging="360"/>
+      </w:pPr>
+      <w:rPr>
+        <w:rFonts w:ascii="Wingdings" w:hAnsi="Wingdings" w:hint="default"/>
+      </w:rPr>
+    </w:lvl>
+    <w:lvl w:ilvl="6" w:tplc="042A0001" w:tentative="1">
+      <w:start w:val="1"/>
+      <w:numFmt w:val="bullet"/>
+      <w:lvlText w:val=""/>
+      <w:lvlJc w:val="left"/>
+      <w:pPr>
+        <w:ind w:left="6120" w:hanging="360"/>
+      </w:pPr>
+      <w:rPr>
+        <w:rFonts w:ascii="Symbol" w:hAnsi="Symbol" w:hint="default"/>
+      </w:rPr>
+    </w:lvl>
+    <w:lvl w:ilvl="7" w:tplc="042A0003" w:tentative="1">
+      <w:start w:val="1"/>
+      <w:numFmt w:val="bullet"/>
+      <w:lvlText w:val="o"/>
+      <w:lvlJc w:val="left"/>
+      <w:pPr>
+        <w:ind w:left="6840" w:hanging="360"/>
+      </w:pPr>
+      <w:rPr>
+        <w:rFonts w:ascii="Courier New" w:hAnsi="Courier New" w:cs="Courier New" w:hint="default"/>
+      </w:rPr>
+    </w:lvl>
+    <w:lvl w:ilvl="8" w:tplc="042A0005" w:tentative="1">
+      <w:start w:val="1"/>
+      <w:numFmt w:val="bullet"/>
+      <w:lvlText w:val=""/>
+      <w:lvlJc w:val="left"/>
+      <w:pPr>
+        <w:ind w:left="7560" w:hanging="360"/>
+      </w:pPr>
+      <w:rPr>
+        <w:rFonts w:ascii="Wingdings" w:hAnsi="Wingdings" w:hint="default"/>
+      </w:rPr>
+    </w:lvl>
+  </w:abstractNum>
+  <w:abstractNum w:abstractNumId="37" w15:restartNumberingAfterBreak="0">
     <w:nsid w:val="6A1D16F0"/>
     <w:multiLevelType w:val="multilevel"/>
     <w:tmpl w:val="54F844C6"/>
@@ -6044,7 +7082,7 @@
       </w:rPr>
     </w:lvl>
   </w:abstractNum>
-  <w:abstractNum w:abstractNumId="33" w15:restartNumberingAfterBreak="0">
+  <w:abstractNum w:abstractNumId="38" w15:restartNumberingAfterBreak="0">
     <w:nsid w:val="6F224CCC"/>
     <w:multiLevelType w:val="multilevel"/>
     <w:tmpl w:val="043605F4"/>
@@ -6193,7 +7231,7 @@
       </w:rPr>
     </w:lvl>
   </w:abstractNum>
-  <w:abstractNum w:abstractNumId="34" w15:restartNumberingAfterBreak="0">
+  <w:abstractNum w:abstractNumId="39" w15:restartNumberingAfterBreak="0">
     <w:nsid w:val="752F5948"/>
     <w:multiLevelType w:val="multilevel"/>
     <w:tmpl w:val="EDB85D06"/>
@@ -6306,7 +7344,7 @@
       </w:pPr>
     </w:lvl>
   </w:abstractNum>
-  <w:abstractNum w:abstractNumId="35" w15:restartNumberingAfterBreak="0">
+  <w:abstractNum w:abstractNumId="40" w15:restartNumberingAfterBreak="0">
     <w:nsid w:val="7C0F1A0B"/>
     <w:multiLevelType w:val="multilevel"/>
     <w:tmpl w:val="A76A1AB8"/>
@@ -6455,7 +7493,7 @@
       </w:rPr>
     </w:lvl>
   </w:abstractNum>
-  <w:abstractNum w:abstractNumId="36" w15:restartNumberingAfterBreak="0">
+  <w:abstractNum w:abstractNumId="41" w15:restartNumberingAfterBreak="0">
     <w:nsid w:val="7E740815"/>
     <w:multiLevelType w:val="hybridMultilevel"/>
     <w:tmpl w:val="8B0CCC9C"/>
@@ -6569,115 +7607,130 @@
     </w:lvl>
   </w:abstractNum>
   <w:num w:numId="1" w16cid:durableId="1739664596">
-    <w:abstractNumId w:val="17"/>
+    <w:abstractNumId w:val="18"/>
   </w:num>
   <w:num w:numId="2" w16cid:durableId="622034295">
-    <w:abstractNumId w:val="34"/>
+    <w:abstractNumId w:val="39"/>
   </w:num>
   <w:num w:numId="3" w16cid:durableId="659577909">
-    <w:abstractNumId w:val="6"/>
+    <w:abstractNumId w:val="7"/>
   </w:num>
   <w:num w:numId="4" w16cid:durableId="1799566526">
-    <w:abstractNumId w:val="12"/>
+    <w:abstractNumId w:val="13"/>
   </w:num>
   <w:num w:numId="5" w16cid:durableId="716318921">
-    <w:abstractNumId w:val="9"/>
+    <w:abstractNumId w:val="10"/>
   </w:num>
   <w:num w:numId="6" w16cid:durableId="1887716540">
-    <w:abstractNumId w:val="32"/>
+    <w:abstractNumId w:val="37"/>
   </w:num>
   <w:num w:numId="7" w16cid:durableId="884684934">
-    <w:abstractNumId w:val="35"/>
+    <w:abstractNumId w:val="40"/>
   </w:num>
   <w:num w:numId="8" w16cid:durableId="1312707573">
     <w:abstractNumId w:val="3"/>
   </w:num>
   <w:num w:numId="9" w16cid:durableId="1928072814">
-    <w:abstractNumId w:val="33"/>
+    <w:abstractNumId w:val="38"/>
   </w:num>
   <w:num w:numId="10" w16cid:durableId="1150295071">
-    <w:abstractNumId w:val="18"/>
+    <w:abstractNumId w:val="19"/>
   </w:num>
   <w:num w:numId="11" w16cid:durableId="658777828">
     <w:abstractNumId w:val="1"/>
   </w:num>
   <w:num w:numId="12" w16cid:durableId="1095204791">
-    <w:abstractNumId w:val="16"/>
+    <w:abstractNumId w:val="17"/>
   </w:num>
   <w:num w:numId="13" w16cid:durableId="687103768">
-    <w:abstractNumId w:val="26"/>
+    <w:abstractNumId w:val="30"/>
   </w:num>
   <w:num w:numId="14" w16cid:durableId="1099443955">
-    <w:abstractNumId w:val="25"/>
+    <w:abstractNumId w:val="29"/>
   </w:num>
   <w:num w:numId="15" w16cid:durableId="1753089535">
-    <w:abstractNumId w:val="27"/>
+    <w:abstractNumId w:val="31"/>
   </w:num>
   <w:num w:numId="16" w16cid:durableId="33622889">
-    <w:abstractNumId w:val="21"/>
+    <w:abstractNumId w:val="22"/>
   </w:num>
   <w:num w:numId="17" w16cid:durableId="1916552058">
-    <w:abstractNumId w:val="31"/>
+    <w:abstractNumId w:val="35"/>
   </w:num>
   <w:num w:numId="18" w16cid:durableId="326133854">
-    <w:abstractNumId w:val="8"/>
+    <w:abstractNumId w:val="9"/>
   </w:num>
   <w:num w:numId="19" w16cid:durableId="645361062">
-    <w:abstractNumId w:val="24"/>
+    <w:abstractNumId w:val="28"/>
   </w:num>
   <w:num w:numId="20" w16cid:durableId="1148745094">
-    <w:abstractNumId w:val="28"/>
+    <w:abstractNumId w:val="32"/>
   </w:num>
   <w:num w:numId="21" w16cid:durableId="1169560299">
     <w:abstractNumId w:val="0"/>
   </w:num>
   <w:num w:numId="22" w16cid:durableId="360400664">
-    <w:abstractNumId w:val="5"/>
+    <w:abstractNumId w:val="6"/>
   </w:num>
   <w:num w:numId="23" w16cid:durableId="1741096005">
     <w:abstractNumId w:val="2"/>
   </w:num>
   <w:num w:numId="24" w16cid:durableId="1412119806">
+    <w:abstractNumId w:val="16"/>
+  </w:num>
+  <w:num w:numId="25" w16cid:durableId="1326280008">
+    <w:abstractNumId w:val="21"/>
+  </w:num>
+  <w:num w:numId="26" w16cid:durableId="1676952314">
+    <w:abstractNumId w:val="11"/>
+  </w:num>
+  <w:num w:numId="27" w16cid:durableId="531845769">
     <w:abstractNumId w:val="15"/>
   </w:num>
-  <w:num w:numId="25" w16cid:durableId="1326280008">
+  <w:num w:numId="28" w16cid:durableId="1372613451">
+    <w:abstractNumId w:val="34"/>
+  </w:num>
+  <w:num w:numId="29" w16cid:durableId="1315523735">
+    <w:abstractNumId w:val="5"/>
+  </w:num>
+  <w:num w:numId="30" w16cid:durableId="141704861">
+    <w:abstractNumId w:val="23"/>
+  </w:num>
+  <w:num w:numId="31" w16cid:durableId="156657817">
+    <w:abstractNumId w:val="41"/>
+  </w:num>
+  <w:num w:numId="32" w16cid:durableId="1732078932">
     <w:abstractNumId w:val="20"/>
   </w:num>
-  <w:num w:numId="26" w16cid:durableId="1676952314">
-    <w:abstractNumId w:val="10"/>
+  <w:num w:numId="33" w16cid:durableId="266542919">
+    <w:abstractNumId w:val="8"/>
   </w:num>
-  <w:num w:numId="27" w16cid:durableId="531845769">
+  <w:num w:numId="34" w16cid:durableId="155343078">
     <w:abstractNumId w:val="14"/>
   </w:num>
-  <w:num w:numId="28" w16cid:durableId="1372613451">
-    <w:abstractNumId w:val="30"/>
+  <w:num w:numId="35" w16cid:durableId="354775550">
+    <w:abstractNumId w:val="33"/>
   </w:num>
-  <w:num w:numId="29" w16cid:durableId="1315523735">
+  <w:num w:numId="36" w16cid:durableId="448354777">
+    <w:abstractNumId w:val="12"/>
+  </w:num>
+  <w:num w:numId="37" w16cid:durableId="925117567">
+    <w:abstractNumId w:val="26"/>
+  </w:num>
+  <w:num w:numId="38" w16cid:durableId="1986855003">
     <w:abstractNumId w:val="4"/>
   </w:num>
-  <w:num w:numId="30" w16cid:durableId="141704861">
-    <w:abstractNumId w:val="22"/>
+  <w:num w:numId="39" w16cid:durableId="229272323">
+    <w:abstractNumId w:val="27"/>
   </w:num>
-  <w:num w:numId="31" w16cid:durableId="156657817">
+  <w:num w:numId="40" w16cid:durableId="896552247">
     <w:abstractNumId w:val="36"/>
   </w:num>
-  <w:num w:numId="32" w16cid:durableId="1732078932">
-    <w:abstractNumId w:val="19"/>
+  <w:num w:numId="41" w16cid:durableId="1764915456">
+    <w:abstractNumId w:val="25"/>
   </w:num>
-  <w:num w:numId="33" w16cid:durableId="266542919">
-    <w:abstractNumId w:val="7"/>
-  </w:num>
-  <w:num w:numId="34" w16cid:durableId="155343078">
-    <w:abstractNumId w:val="13"/>
-  </w:num>
-  <w:num w:numId="35" w16cid:durableId="354775550">
-    <w:abstractNumId w:val="29"/>
-  </w:num>
-  <w:num w:numId="36" w16cid:durableId="448354777">
-    <w:abstractNumId w:val="11"/>
-  </w:num>
-  <w:num w:numId="37" w16cid:durableId="925117567">
-    <w:abstractNumId w:val="23"/>
+  <w:num w:numId="42" w16cid:durableId="694691396">
+    <w:abstractNumId w:val="24"/>
   </w:num>
 </w:numbering>
 </file>

</xml_diff>